<commit_message>
Fold draft Laidlaw craft into the final Stage 3 report and poster.
Numbered limitations, a Methods reading gloss, Bishai moved to Acknowledgements, and data-provider confirmation sit in the essay. The A0 poster keeps its references, shows the pre-2020 CHD collapse, and restores a human collaborator footer without the robotic stock lines.

Co-authored-by: Shen Ruililin <bobshenruililin@users.noreply.github.com>
</commit_message>
<xml_diff>
--- a/outputs/ShenRuililin_Laidlaw_Stage3Report.docx
+++ b/outputs/ShenRuililin_Laidlaw_Stage3Report.docx
@@ -426,7 +426,7 @@
         <w:pStyle w:val="BodyText"/>
       </w:pPr>
       <w:r>
-        <w:t xml:space="preserve">This Laidlaw Scholars project was supervised by Professor David Makram Bishai at the School of Public Health. He set the scientific direction of the work: a complete comparison of heat and cold encodings in one Hong Kong panel, rather than a search for a single confirmatory association, and a plain account of what monthly Hospital Authority aggregates can support. He asked that every comparison be reported, that uncertainty be shown under more than one standard-error method, and that the limits of monthly aggregates be stated in the same document as the estimates. The study sits within a School of Public Health programme he leads on temperature and health in Hong Kong, which also includes complementary modelled heatwave-mortality work</w:t>
+        <w:t xml:space="preserve">At Hong Kong Observatory Headquarters, official hot nights rose from 10 in 2013 to a peak of 61 in 2021</w:t>
       </w:r>
       <w:r>
         <w:t xml:space="preserve"> </w:t>
@@ -434,7 +434,7 @@
       <w:r>
         <w:t xml:space="preserve">[</w:t>
       </w:r>
-      <w:hyperlink w:anchor="ref-liu2026roro">
+      <w:hyperlink w:anchor="ref-hko2013">
         <w:r>
           <w:rPr>
             <w:rStyle w:val="Hyperlink"/>
@@ -443,26 +443,9 @@
         </w:r>
       </w:hyperlink>
       <w:r>
-        <w:t xml:space="preserve">]</w:t>
-      </w:r>
-      <w:r>
-        <w:t xml:space="preserve">.</w:t>
-      </w:r>
-    </w:p>
-    <w:p>
-      <w:pPr>
-        <w:pStyle w:val="BodyText"/>
-      </w:pPr>
-      <w:r>
-        <w:t xml:space="preserve">At Hong Kong Observatory Headquarters, official hot nights rose from 10 in 2013 to a peak of 61 in 2021</w:t>
-      </w:r>
-      <w:r>
-        <w:t xml:space="preserve"> </w:t>
-      </w:r>
-      <w:r>
-        <w:t xml:space="preserve">[</w:t>
-      </w:r>
-      <w:hyperlink w:anchor="ref-hko2013">
+        <w:t xml:space="preserve">,</w:t>
+      </w:r>
+      <w:hyperlink w:anchor="ref-hko2021">
         <w:r>
           <w:rPr>
             <w:rStyle w:val="Hyperlink"/>
@@ -471,9 +454,26 @@
         </w:r>
       </w:hyperlink>
       <w:r>
-        <w:t xml:space="preserve">,</w:t>
-      </w:r>
-      <w:hyperlink w:anchor="ref-hko2021">
+        <w:t xml:space="preserve">]</w:t>
+      </w:r>
+      <w:r>
+        <w:t xml:space="preserve">. Cold days persisted across the same decade. A contemporary local analysis therefore has to hold heat and cold in one design.</w:t>
+      </w:r>
+    </w:p>
+    <w:p>
+      <w:pPr>
+        <w:pStyle w:val="BodyText"/>
+      </w:pPr>
+      <w:r>
+        <w:t xml:space="preserve">Temperature can affect cardiovascular health through several pathways. Heat can promote dehydration, disturb sleep and overnight recovery, and increase cardiac demand. Cold can raise blood pressure and vascular resistance. Responses may be stronger in people whose cardiovascular regulation is already compromised by diabetes or hypertension</w:t>
+      </w:r>
+      <w:r>
+        <w:t xml:space="preserve"> </w:t>
+      </w:r>
+      <w:r>
+        <w:t xml:space="preserve">[</w:t>
+      </w:r>
+      <w:hyperlink w:anchor="ref-ye2012">
         <w:r>
           <w:rPr>
             <w:rStyle w:val="Hyperlink"/>
@@ -485,7 +485,7 @@
         <w:t xml:space="preserve">]</w:t>
       </w:r>
       <w:r>
-        <w:t xml:space="preserve">. Cold days persisted across the same decade. A contemporary local analysis therefore has to hold heat and cold in one design.</w:t>
+        <w:t xml:space="preserve">. These mechanisms make both sides of the temperature distribution relevant.</w:t>
       </w:r>
     </w:p>
     <w:p>
@@ -493,7 +493,7 @@
         <w:pStyle w:val="BodyText"/>
       </w:pPr>
       <w:r>
-        <w:t xml:space="preserve">Temperature can affect cardiovascular health through several pathways. Heat can promote dehydration, disturb sleep and overnight recovery, and increase cardiac demand. Cold can raise blood pressure and vascular resistance. Responses may be stronger in people whose cardiovascular regulation is already compromised by diabetes or hypertension</w:t>
+        <w:t xml:space="preserve">Hong Kong already has important evidence on daily temperature and health. Earlier studies examined daily stroke or acute myocardial infarction admissions and reported substantial cold-related patterns</w:t>
       </w:r>
       <w:r>
         <w:t xml:space="preserve"> </w:t>
@@ -501,7 +501,7 @@
       <w:r>
         <w:t xml:space="preserve">[</w:t>
       </w:r>
-      <w:hyperlink w:anchor="ref-ye2012">
+      <w:hyperlink w:anchor="ref-goggins2012stroke">
         <w:r>
           <w:rPr>
             <w:rStyle w:val="Hyperlink"/>
@@ -510,26 +510,9 @@
         </w:r>
       </w:hyperlink>
       <w:r>
-        <w:t xml:space="preserve">]</w:t>
-      </w:r>
-      <w:r>
-        <w:t xml:space="preserve">. These mechanisms make both sides of the temperature distribution relevant.</w:t>
-      </w:r>
-    </w:p>
-    <w:p>
-      <w:pPr>
-        <w:pStyle w:val="BodyText"/>
-      </w:pPr>
-      <w:r>
-        <w:t xml:space="preserve">Hong Kong already has important evidence on daily temperature and health. Earlier studies examined daily stroke or acute myocardial infarction admissions and reported substantial cold-related patterns</w:t>
-      </w:r>
-      <w:r>
-        <w:t xml:space="preserve"> </w:t>
-      </w:r>
-      <w:r>
-        <w:t xml:space="preserve">[</w:t>
-      </w:r>
-      <w:hyperlink w:anchor="ref-goggins2012stroke">
+        <w:t xml:space="preserve">,</w:t>
+      </w:r>
+      <w:hyperlink w:anchor="ref-goggins2013">
         <w:r>
           <w:rPr>
             <w:rStyle w:val="Hyperlink"/>
@@ -538,9 +521,18 @@
         </w:r>
       </w:hyperlink>
       <w:r>
-        <w:t xml:space="preserve">,</w:t>
-      </w:r>
-      <w:hyperlink w:anchor="ref-goggins2013">
+        <w:t xml:space="preserve">]</w:t>
+      </w:r>
+      <w:r>
+        <w:t xml:space="preserve">. Closest to the present outcomes, Goggins and Chan analysed daily public-hospital heart-failure admissions and deaths during 2002–2011 and reported a strong cold association</w:t>
+      </w:r>
+      <w:r>
+        <w:t xml:space="preserve"> </w:t>
+      </w:r>
+      <w:r>
+        <w:t xml:space="preserve">[</w:t>
+      </w:r>
+      <w:hyperlink w:anchor="ref-goggins2017hf">
         <w:r>
           <w:rPr>
             <w:rStyle w:val="Hyperlink"/>
@@ -552,7 +544,7 @@
         <w:t xml:space="preserve">]</w:t>
       </w:r>
       <w:r>
-        <w:t xml:space="preserve">. Closest to the present outcomes, Goggins and Chan analysed daily public-hospital heart-failure admissions and deaths during 2002–2011 and reported a strong cold association</w:t>
+        <w:t xml:space="preserve">. Liu and colleagues estimated mortality attributable to non-optimal temperature and found a larger fraction associated with cold than heat during 2006–2016</w:t>
       </w:r>
       <w:r>
         <w:t xml:space="preserve"> </w:t>
@@ -560,7 +552,7 @@
       <w:r>
         <w:t xml:space="preserve">[</w:t>
       </w:r>
-      <w:hyperlink w:anchor="ref-goggins2017hf">
+      <w:hyperlink w:anchor="ref-liu2020jasmine">
         <w:r>
           <w:rPr>
             <w:rStyle w:val="Hyperlink"/>
@@ -572,7 +564,7 @@
         <w:t xml:space="preserve">]</w:t>
       </w:r>
       <w:r>
-        <w:t xml:space="preserve">. Liu and colleagues estimated mortality attributable to non-optimal temperature and found a larger fraction associated with cold than heat during 2006–2016</w:t>
+        <w:t xml:space="preserve">. More recent work modelled heat-related excess deaths under several heatwave definitions</w:t>
       </w:r>
       <w:r>
         <w:t xml:space="preserve"> </w:t>
@@ -580,32 +572,12 @@
       <w:r>
         <w:t xml:space="preserve">[</w:t>
       </w:r>
-      <w:hyperlink w:anchor="ref-liu2020jasmine">
+      <w:hyperlink w:anchor="ref-liu2026roro">
         <w:r>
           <w:rPr>
             <w:rStyle w:val="Hyperlink"/>
           </w:rPr>
           <w:t xml:space="preserve">8</w:t>
-        </w:r>
-      </w:hyperlink>
-      <w:r>
-        <w:t xml:space="preserve">]</w:t>
-      </w:r>
-      <w:r>
-        <w:t xml:space="preserve">. More recent work modelled heat-related excess deaths under several heatwave definitions</w:t>
-      </w:r>
-      <w:r>
-        <w:t xml:space="preserve"> </w:t>
-      </w:r>
-      <w:r>
-        <w:t xml:space="preserve">[</w:t>
-      </w:r>
-      <w:hyperlink w:anchor="ref-liu2026roro">
-        <w:r>
-          <w:rPr>
-            <w:rStyle w:val="Hyperlink"/>
-          </w:rPr>
-          <w:t xml:space="preserve">1</w:t>
         </w:r>
       </w:hyperlink>
       <w:r>
@@ -660,7 +632,7 @@
       </w:r>
     </w:p>
     <w:bookmarkEnd w:id="21"/>
-    <w:bookmarkStart w:id="29" w:name="methods"/>
+    <w:bookmarkStart w:id="27" w:name="methods"/>
     <w:p>
       <w:pPr>
         <w:pStyle w:val="Heading1"/>
@@ -669,7 +641,7 @@
         <w:t xml:space="preserve">Methods</w:t>
       </w:r>
     </w:p>
-    <w:bookmarkStart w:id="23" w:name="study-design"/>
+    <w:bookmarkStart w:id="22" w:name="study-design"/>
     <w:p>
       <w:pPr>
         <w:pStyle w:val="Heading2"/>
@@ -683,19 +655,7 @@
         <w:pStyle w:val="FirstParagraph"/>
       </w:pPr>
       <w:r>
-        <w:t xml:space="preserve">The design is an ecological territory-month time series covering January 2013 through December 2023 (132 months). For each single-exposure model, the target quantity is a count ratio associated with a 1 °C or five-day exposure contrast, conditional on calendar month and a smooth function of time.</w:t>
-      </w:r>
-      <w:r>
-        <w:rPr>
-          <w:rStyle w:val="FootnoteReference"/>
-        </w:rPr>
-        <w:footnoteReference w:id="22"/>
-      </w:r>
-      <w:r>
-        <w:t xml:space="preserve"> </w:t>
-      </w:r>
-      <w:r>
-        <w:t xml:space="preserve">Individual causal effects, principal-diagnosis CHD or HF, acute myocardial infarction, and daily triggering are not identified</w:t>
+        <w:t xml:space="preserve">The design is an ecological territory-month time series covering January 2013 through December 2023 (132 months). For each single-exposure model, the target quantity is a count ratio associated with a 1 °C or five-day exposure contrast, conditional on calendar month and a smooth function of time. Individual causal effects, principal-diagnosis CHD or HF, acute myocardial infarction, and daily triggering are not identified</w:t>
       </w:r>
       <w:r>
         <w:t xml:space="preserve"> </w:t>
@@ -729,8 +689,8 @@
         <w:t xml:space="preserve">.</w:t>
       </w:r>
     </w:p>
-    <w:bookmarkEnd w:id="23"/>
-    <w:bookmarkStart w:id="24" w:name="health-data"/>
+    <w:bookmarkEnd w:id="22"/>
+    <w:bookmarkStart w:id="23" w:name="health-data"/>
     <w:p>
       <w:pPr>
         <w:pStyle w:val="Heading2"/>
@@ -744,11 +704,11 @@
         <w:pStyle w:val="FirstParagraph"/>
       </w:pPr>
       <w:r>
-        <w:t xml:space="preserve">Governed Hospital Authority aggregates supplied the two outcomes. The cohort comprised people recorded with type 2 diabetes and/or hypertension during the study period. For each outcome, the monthly series counted the first recorded hospitalisation after the person’s first CHD or HF diagnosis record. Diagnosis-record construction was assisted by a clinical collaborator. Admission cause was not recorded. Age–sex strata were not included. A stroke series was named in correspondence but was not attached, and no stroke analysis is reported. Source monthly health files and merged health panels were not placed in public version control.</w:t>
+        <w:t xml:space="preserve">Governed Hospital Authority aggregates supplied the two outcomes. The cohort comprised people recorded with type 2 diabetes and/or hypertension during the study period. For each outcome, the monthly series counted the first recorded hospitalisation after the person’s first CHD or HF diagnosis record. Diagnosis-record construction was assisted by a clinical collaborator. Admission cause was not recorded. Delivered columns are labelled inpatient; the inpatient inclusion rule and event-timing semantics require data-provider confirmation. Age–sex strata were not included. A stroke series was named in correspondence but was not attached, and no stroke analysis is reported. Source monthly health files and merged health panels were not placed in public version control.</w:t>
       </w:r>
     </w:p>
-    <w:bookmarkEnd w:id="24"/>
-    <w:bookmarkStart w:id="25" w:name="temperature-measures"/>
+    <w:bookmarkEnd w:id="23"/>
+    <w:bookmarkStart w:id="24" w:name="temperature-measures"/>
     <w:p>
       <w:pPr>
         <w:pStyle w:val="Heading2"/>
@@ -796,8 +756,8 @@
         <w:t xml:space="preserve">; the six measures give the clearest common comparison. Air-pollution and influenza series were assembled for the broader project; the core models reported here do not claim that confounding by those factors has been resolved.</w:t>
       </w:r>
     </w:p>
-    <w:bookmarkEnd w:id="25"/>
-    <w:bookmarkStart w:id="28" w:name="statistical-analysis"/>
+    <w:bookmarkEnd w:id="24"/>
+    <w:bookmarkStart w:id="26" w:name="statistical-analysis"/>
     <w:p>
       <w:pPr>
         <w:pStyle w:val="Heading2"/>
@@ -837,7 +797,7 @@
         <w:rPr>
           <w:rStyle w:val="FootnoteReference"/>
         </w:rPr>
-        <w:footnoteReference w:id="26"/>
+        <w:footnoteReference w:id="25"/>
       </w:r>
       <w:r>
         <w:t xml:space="preserve"> </w:t>
@@ -858,11 +818,36 @@
       <w:r>
         <w:t xml:space="preserve">-values were calculated across the complete panel.</w:t>
       </w:r>
+    </w:p>
+    <w:p>
+      <w:pPr>
+        <w:pStyle w:val="BodyText"/>
+      </w:pPr>
       <w:r>
         <w:rPr>
-          <w:rStyle w:val="FootnoteReference"/>
+          <w:bCs/>
+          <w:b/>
         </w:rPr>
-        <w:footnoteReference w:id="27"/>
+        <w:t xml:space="preserve">How to read the estimates.</w:t>
+      </w:r>
+      <w:r>
+        <w:t xml:space="preserve"> </w:t>
+      </w:r>
+      <w:r>
+        <w:t xml:space="preserve">A count ratio of 1 means no estimated difference in the monthly count; 1.05 means a 5% higher count for the stated exposure change. Because monthly counts of cohort members still at risk of a first event were unavailable, these are count ratios rather than incidence-rate ratios. A</w:t>
+      </w:r>
+      <w:r>
+        <w:t xml:space="preserve"> </w:t>
+      </w:r>
+      <w:r>
+        <w:rPr>
+          <w:iCs/>
+          <w:i/>
+        </w:rPr>
+        <w:t xml:space="preserve">q</w:t>
+      </w:r>
+      <w:r>
+        <w:t xml:space="preserve">-value limits the expected proportion of false discoveries when all twelve comparisons are considered together; it is not the probability that a result is true.</w:t>
       </w:r>
     </w:p>
     <w:p>
@@ -920,9 +905,9 @@
         <w:t xml:space="preserve">Analyses used R 4.3.3. Governed aggregates were analysed under existing collaborative arrangements; aggregation does not by itself confer external-publication authority.</w:t>
       </w:r>
     </w:p>
-    <w:bookmarkEnd w:id="28"/>
-    <w:bookmarkEnd w:id="29"/>
-    <w:bookmarkStart w:id="39" w:name="results"/>
+    <w:bookmarkEnd w:id="26"/>
+    <w:bookmarkEnd w:id="27"/>
+    <w:bookmarkStart w:id="37" w:name="results"/>
     <w:p>
       <w:pPr>
         <w:pStyle w:val="Heading1"/>
@@ -931,7 +916,7 @@
         <w:t xml:space="preserve">Results</w:t>
       </w:r>
     </w:p>
-    <w:bookmarkStart w:id="33" w:name="outcome-and-exposure-series"/>
+    <w:bookmarkStart w:id="31" w:name="outcome-and-exposure-series"/>
     <w:p>
       <w:pPr>
         <w:pStyle w:val="Heading2"/>
@@ -955,13 +940,30 @@
         <w:spacing w:before="200" w:after="80"/>
         <w:jc w:val="left"/>
       </w:pPr>
+      <w:r>
+        <w:rPr>
+          <w:bCs/>
+          <w:rFonts w:ascii="Liberation Serif" w:hAnsi="Liberation Serif"/>
+          <w:b/>
+          <w:sz w:val="20"/>
+        </w:rPr>
+        <w:t xml:space="preserve">Table 1.</w:t>
+      </w:r>
       <w:r>
         <w:rPr>
           <w:rFonts w:ascii="Liberation Serif" w:hAnsi="Liberation Serif"/>
           <w:b/>
           <w:sz w:val="20"/>
         </w:rPr>
-        <w:t xml:space="preserve">Table 1. Outcome summary, Hong Kong, 2013–2023.</w:t>
+        <w:t xml:space="preserve"> </w:t>
+      </w:r>
+      <w:r>
+        <w:rPr>
+          <w:rFonts w:ascii="Liberation Serif" w:hAnsi="Liberation Serif"/>
+          <w:b/>
+          <w:sz w:val="20"/>
+        </w:rPr>
+        <w:t xml:space="preserve">Outcome summary, Hong Kong, 2013–2023.</w:t>
       </w:r>
     </w:p>
     <w:tbl>
@@ -1420,18 +1422,18 @@
           <wp:inline>
             <wp:extent cx="4717542" cy="4586499"/>
             <wp:effectExtent b="0" l="0" r="0" t="0"/>
-            <wp:docPr descr="Official hot nights, very hot days and cold days at Hong Kong Observatory Headquarters, 2013–2023. These are environmental descriptors, not health findings." title="" id="31" name="Picture"/>
+            <wp:docPr descr="Official hot nights, very hot days and cold days at Hong Kong Observatory Headquarters, 2013–2023. These are environmental descriptors, not health findings." title="" id="29" name="Picture"/>
             <a:graphic>
               <a:graphicData uri="http://schemas.openxmlformats.org/drawingml/2006/picture">
                 <pic:pic>
                   <pic:nvPicPr>
-                    <pic:cNvPr descr="figures/exposure_aging/fig01_annual_extremes_coexistence.png" id="32" name="Picture"/>
+                    <pic:cNvPr descr="figures/exposure_aging/fig01_annual_extremes_coexistence.png" id="30" name="Picture"/>
                     <pic:cNvPicPr>
                       <a:picLocks noChangeArrowheads="1" noChangeAspect="1"/>
                     </pic:cNvPicPr>
                   </pic:nvPicPr>
                   <pic:blipFill>
-                    <a:blip r:embed="rId30"/>
+                    <a:blip r:embed="rId28"/>
                     <a:stretch>
                       <a:fillRect/>
                     </a:stretch>
@@ -1466,8 +1468,8 @@
         <w:t xml:space="preserve">Official hot nights, very hot days and cold days at Hong Kong Observatory Headquarters, 2013–2023. These are environmental descriptors, not health findings.</w:t>
       </w:r>
     </w:p>
-    <w:bookmarkEnd w:id="33"/>
-    <w:bookmarkStart w:id="37" w:name="core-panel"/>
+    <w:bookmarkEnd w:id="31"/>
+    <w:bookmarkStart w:id="35" w:name="core-panel"/>
     <w:p>
       <w:pPr>
         <w:pStyle w:val="Heading2"/>
@@ -1629,11 +1631,28 @@
       </w:pPr>
       <w:r>
         <w:rPr>
+          <w:bCs/>
           <w:rFonts w:ascii="Liberation Serif" w:hAnsi="Liberation Serif"/>
           <w:b/>
           <w:sz w:val="20"/>
         </w:rPr>
-        <w:t xml:space="preserve">Table 2. Separate negative-binomial models with a days-in-month offset and Newey–West lag-6 intervals.</w:t>
+        <w:t xml:space="preserve">Table 2.</w:t>
+      </w:r>
+      <w:r>
+        <w:rPr>
+          <w:rFonts w:ascii="Liberation Serif" w:hAnsi="Liberation Serif"/>
+          <w:b/>
+          <w:sz w:val="20"/>
+        </w:rPr>
+        <w:t xml:space="preserve"> </w:t>
+      </w:r>
+      <w:r>
+        <w:rPr>
+          <w:rFonts w:ascii="Liberation Serif" w:hAnsi="Liberation Serif"/>
+          <w:b/>
+          <w:sz w:val="20"/>
+        </w:rPr>
+        <w:t xml:space="preserve">Separate negative-binomial models with a days-in-month offset and Newey–West lag-6 intervals.</w:t>
       </w:r>
     </w:p>
     <w:tbl>
@@ -3406,18 +3425,18 @@
           <wp:inline>
             <wp:extent cx="5062728" cy="3192587"/>
             <wp:effectExtent b="0" l="0" r="0" t="0"/>
-            <wp:docPr descr="Count ratios and 95% confidence intervals for the twelve core monthly models. The dashed line at 1 indicates no estimated difference. All twelve Benjamini–Hochberg q-values exceeded 0.19." title="" id="35" name="Picture"/>
+            <wp:docPr descr="Count ratios and 95% confidence intervals for the twelve core monthly models. The dashed line at 1 indicates no estimated difference. All twelve Benjamini–Hochberg q-values exceeded 0.19." title="" id="33" name="Picture"/>
             <a:graphic>
               <a:graphicData uri="http://schemas.openxmlformats.org/drawingml/2006/picture">
                 <pic:pic>
                   <pic:nvPicPr>
-                    <pic:cNvPr descr="outputs/release_chd_hf/figures/figure3_core_forest.png" id="36" name="Picture"/>
+                    <pic:cNvPr descr="outputs/release_chd_hf/figures/figure3_core_forest.png" id="34" name="Picture"/>
                     <pic:cNvPicPr>
                       <a:picLocks noChangeArrowheads="1" noChangeAspect="1"/>
                     </pic:cNvPicPr>
                   </pic:nvPicPr>
                   <pic:blipFill>
-                    <a:blip r:embed="rId34"/>
+                    <a:blip r:embed="rId32"/>
                     <a:stretch>
                       <a:fillRect/>
                     </a:stretch>
@@ -3465,8 +3484,8 @@
         <w:t xml:space="preserve">-values exceeded 0.19.</w:t>
       </w:r>
     </w:p>
-    <w:bookmarkEnd w:id="37"/>
-    <w:bookmarkStart w:id="38" w:name="uncertainty-and-robustness"/>
+    <w:bookmarkEnd w:id="35"/>
+    <w:bookmarkStart w:id="36" w:name="uncertainty-and-robustness"/>
     <w:p>
       <w:pPr>
         <w:pStyle w:val="Heading2"/>
@@ -3523,9 +3542,9 @@
         <w:t xml:space="preserve">The attempted monthly-outcome, daily-exposure estimator passed numerical convergence checks but failed calibration (Appendix). No daily coefficient was applied to the real health series.</w:t>
       </w:r>
     </w:p>
-    <w:bookmarkEnd w:id="38"/>
-    <w:bookmarkEnd w:id="39"/>
-    <w:bookmarkStart w:id="40" w:name="discussion"/>
+    <w:bookmarkEnd w:id="36"/>
+    <w:bookmarkEnd w:id="37"/>
+    <w:bookmarkStart w:id="39" w:name="discussion"/>
     <w:p>
       <w:pPr>
         <w:pStyle w:val="Heading1"/>
@@ -3586,7 +3605,7 @@
           <w:rPr>
             <w:rStyle w:val="Hyperlink"/>
           </w:rPr>
-          <w:t xml:space="preserve">7</w:t>
+          <w:t xml:space="preserve">6</w:t>
         </w:r>
       </w:hyperlink>
       <w:r>
@@ -3629,18 +3648,18 @@
       <w:r>
         <w:t xml:space="preserve">[</w:t>
       </w:r>
-      <w:hyperlink w:anchor="ref-liu2026roro">
+      <w:hyperlink w:anchor="ref-liu2020jasmine">
         <w:r>
           <w:rPr>
             <w:rStyle w:val="Hyperlink"/>
           </w:rPr>
-          <w:t xml:space="preserve">1</w:t>
+          <w:t xml:space="preserve">7</w:t>
         </w:r>
       </w:hyperlink>
       <w:r>
         <w:t xml:space="preserve">,</w:t>
       </w:r>
-      <w:hyperlink w:anchor="ref-liu2020jasmine">
+      <w:hyperlink w:anchor="ref-liu2026roro">
         <w:r>
           <w:rPr>
             <w:rStyle w:val="Hyperlink"/>
@@ -3660,14 +3679,6 @@
         <w:pStyle w:val="BodyText"/>
       </w:pPr>
       <w:r>
-        <w:t xml:space="preserve">Null or uncertain findings can be useful when they close off weak claims. The data cannot identify within-month timing, individual exposure, or the cause of admission. The failed daily-exposure calibration is an empirical reason not to present a daily coefficient. The present findings do not justify disease-specific warning thresholds. They do support continued attention to both overnight heat and winter cold, and they motivate a governed design with dated, cause-recorded admissions, cohort person-time, and daily or weekly outcome resolution. Those next hypotheses—whether repeated hot nights precede CHD-related admissions, and whether cold days precede HF-related admissions in this cohort—should be declared in advance, with heat and cold retained and the full uncertainty display preserved.</w:t>
-      </w:r>
-    </w:p>
-    <w:p>
-      <w:pPr>
-        <w:pStyle w:val="BodyText"/>
-      </w:pPr>
-      <w:r>
         <w:rPr>
           <w:bCs/>
           <w:b/>
@@ -3696,7 +3707,51 @@
         <w:t xml:space="preserve"> </w:t>
       </w:r>
       <w:r>
-        <w:t xml:space="preserve">Admission cause was not recorded, so an event is a first hospitalisation after a first diagnosis and not a cardiac-caused admission. Monthly counts of cohort members still at risk were unavailable, so the estimates are count ratios rather than incidence-rate ratios. The design is ecological and monthly</w:t>
+        <w:t xml:space="preserve">Nine limitations determine how these results should be read:</w:t>
+      </w:r>
+    </w:p>
+    <w:p>
+      <w:pPr>
+        <w:numPr>
+          <w:ilvl w:val="0"/>
+          <w:numId w:val="1001"/>
+        </w:numPr>
+        <w:pStyle w:val="Compact"/>
+      </w:pPr>
+      <w:r>
+        <w:rPr>
+          <w:bCs/>
+          <w:b/>
+        </w:rPr>
+        <w:t xml:space="preserve">Outcome meaning.</w:t>
+      </w:r>
+      <w:r>
+        <w:t xml:space="preserve"> </w:t>
+      </w:r>
+      <w:r>
+        <w:t xml:space="preserve">Admission cause was not recorded, and event semantics await data-provider confirmation (Methods); an event is a first hospitalisation after a first CHD or HF diagnosis, not a demonstrated cardiac-caused admission.</w:t>
+      </w:r>
+    </w:p>
+    <w:p>
+      <w:pPr>
+        <w:numPr>
+          <w:ilvl w:val="0"/>
+          <w:numId w:val="1001"/>
+        </w:numPr>
+        <w:pStyle w:val="Compact"/>
+      </w:pPr>
+      <w:r>
+        <w:rPr>
+          <w:bCs/>
+          <w:b/>
+        </w:rPr>
+        <w:t xml:space="preserve">Ecological resolution.</w:t>
+      </w:r>
+      <w:r>
+        <w:t xml:space="preserve"> </w:t>
+      </w:r>
+      <w:r>
+        <w:t xml:space="preserve">Each observation describes Hong Kong for one month; individual exposure and within-month timing are unknown</w:t>
       </w:r>
       <w:r>
         <w:t xml:space="preserve"> </w:t>
@@ -3716,17 +3771,228 @@
         <w:t xml:space="preserve">]</w:t>
       </w:r>
       <w:r>
-        <w:t xml:space="preserve">. Residual serial correlation remains material for CHD. Official cold days are concentrated in December–February. The CHD hot-night estimate is compatible with 1 before 2020. Headquarters weather is a territory-level proxy. Confounding by pollution, humidity and influenza is unresolved in the core panel. Age, sex and disease-subtype strata were not delivered. A stroke series was not delivered, and no stroke result is reported.</w:t>
+        <w:t xml:space="preserve">.</w:t>
+      </w:r>
+    </w:p>
+    <w:p>
+      <w:pPr>
+        <w:numPr>
+          <w:ilvl w:val="0"/>
+          <w:numId w:val="1001"/>
+        </w:numPr>
+        <w:pStyle w:val="Compact"/>
+      </w:pPr>
+      <w:r>
+        <w:rPr>
+          <w:bCs/>
+          <w:b/>
+        </w:rPr>
+        <w:t xml:space="preserve">Denominator.</w:t>
+      </w:r>
+      <w:r>
+        <w:t xml:space="preserve"> </w:t>
+      </w:r>
+      <w:r>
+        <w:t xml:space="preserve">Monthly counts of cohort members still at risk of a first event were unavailable, so the estimates are count ratios rather than incidence-rate ratios.</w:t>
+      </w:r>
+    </w:p>
+    <w:p>
+      <w:pPr>
+        <w:numPr>
+          <w:ilvl w:val="0"/>
+          <w:numId w:val="1001"/>
+        </w:numPr>
+        <w:pStyle w:val="Compact"/>
+      </w:pPr>
+      <w:r>
+        <w:rPr>
+          <w:bCs/>
+          <w:b/>
+        </w:rPr>
+        <w:t xml:space="preserve">Confounding.</w:t>
+      </w:r>
+      <w:r>
+        <w:t xml:space="preserve"> </w:t>
+      </w:r>
+      <w:r>
+        <w:t xml:space="preserve">Adjustment for pollution, humidity and influenza is unresolved in the core panel.</w:t>
+      </w:r>
+    </w:p>
+    <w:p>
+      <w:pPr>
+        <w:numPr>
+          <w:ilvl w:val="0"/>
+          <w:numId w:val="1001"/>
+        </w:numPr>
+        <w:pStyle w:val="Compact"/>
+      </w:pPr>
+      <w:r>
+        <w:rPr>
+          <w:bCs/>
+          <w:b/>
+        </w:rPr>
+        <w:t xml:space="preserve">Exposure measurement.</w:t>
+      </w:r>
+      <w:r>
+        <w:t xml:space="preserve"> </w:t>
+      </w:r>
+      <w:r>
+        <w:t xml:space="preserve">Headquarters weather is a territory-level proxy for neighbourhood, indoor and personal exposure.</w:t>
+      </w:r>
+    </w:p>
+    <w:p>
+      <w:pPr>
+        <w:numPr>
+          <w:ilvl w:val="0"/>
+          <w:numId w:val="1001"/>
+        </w:numPr>
+        <w:pStyle w:val="Compact"/>
+      </w:pPr>
+      <w:r>
+        <w:rPr>
+          <w:bCs/>
+          <w:b/>
+        </w:rPr>
+        <w:t xml:space="preserve">Serial dependence.</w:t>
+      </w:r>
+      <w:r>
+        <w:t xml:space="preserve"> </w:t>
+      </w:r>
+      <w:r>
+        <w:t xml:space="preserve">CHD residual autocorrelation remained material (0.508 at lag 1), and the Newey–West intervals were narrower than the model-based interval, so their exclusion of 1 is a reason for caution rather than confirmation.</w:t>
+      </w:r>
+    </w:p>
+    <w:p>
+      <w:pPr>
+        <w:numPr>
+          <w:ilvl w:val="0"/>
+          <w:numId w:val="1001"/>
+        </w:numPr>
+        <w:pStyle w:val="Compact"/>
+      </w:pPr>
+      <w:r>
+        <w:rPr>
+          <w:bCs/>
+          <w:b/>
+        </w:rPr>
+        <w:t xml:space="preserve">Multiplicity.</w:t>
+      </w:r>
+      <w:r>
+        <w:t xml:space="preserve"> </w:t>
+      </w:r>
+      <w:r>
+        <w:t xml:space="preserve">No comparison survived Benjamini–Hochberg correction across the twelve contrasts; every</w:t>
+      </w:r>
+      <w:r>
+        <w:t xml:space="preserve"> </w:t>
+      </w:r>
+      <w:r>
+        <w:rPr>
+          <w:iCs/>
+          <w:i/>
+        </w:rPr>
+        <w:t xml:space="preserve">q</w:t>
+      </w:r>
+      <w:r>
+        <w:t xml:space="preserve">-value exceeded 0.19.</w:t>
+      </w:r>
+    </w:p>
+    <w:p>
+      <w:pPr>
+        <w:numPr>
+          <w:ilvl w:val="0"/>
+          <w:numId w:val="1001"/>
+        </w:numPr>
+        <w:pStyle w:val="Compact"/>
+      </w:pPr>
+      <w:r>
+        <w:rPr>
+          <w:bCs/>
+          <w:b/>
+        </w:rPr>
+        <w:t xml:space="preserve">Period and season structure.</w:t>
+      </w:r>
+      <w:r>
+        <w:t xml:space="preserve"> </w:t>
+      </w:r>
+      <w:r>
+        <w:t xml:space="preserve">The CHD hot-night estimate is compatible with 1 before 2020 (1.011, 0.991–1.032), whereas the HF cold-day estimate is stronger before 2020 (1.113, 1.053–1.176); official cold days are concentrated in December–February (141 of 145), so the HF contrast is identified between winters.</w:t>
+      </w:r>
+    </w:p>
+    <w:p>
+      <w:pPr>
+        <w:numPr>
+          <w:ilvl w:val="0"/>
+          <w:numId w:val="1001"/>
+        </w:numPr>
+        <w:pStyle w:val="Compact"/>
+      </w:pPr>
+      <w:r>
+        <w:rPr>
+          <w:bCs/>
+          <w:b/>
+        </w:rPr>
+        <w:t xml:space="preserve">Available outcomes.</w:t>
+      </w:r>
+      <w:r>
+        <w:t xml:space="preserve"> </w:t>
+      </w:r>
+      <w:r>
+        <w:t xml:space="preserve">Age, sex and disease-subtype strata were not delivered; a stroke series was not delivered, and no stroke result is reported.</w:t>
+      </w:r>
+    </w:p>
+    <w:bookmarkStart w:id="38" w:name="implications-and-next-study"/>
+    <w:p>
+      <w:pPr>
+        <w:pStyle w:val="Heading2"/>
+      </w:pPr>
+      <w:r>
+        <w:t xml:space="preserve">Implications and next study</w:t>
+      </w:r>
+    </w:p>
+    <w:p>
+      <w:pPr>
+        <w:pStyle w:val="FirstParagraph"/>
+      </w:pPr>
+      <w:r>
+        <w:t xml:space="preserve">Null or uncertain findings can be useful when they close off weak claims. The data cannot identify within-month timing, individual exposure, or the cause of admission. The failed daily-exposure calibration is an empirical reason not to present a daily coefficient. The present findings do not justify disease-specific warning thresholds. They do support continued attention to both overnight heat and winter cold, and they motivate a governed design with dated, cause-recorded admissions, cohort person-time, and daily or weekly outcome resolution. Those next hypotheses—whether repeated hot nights precede CHD-related admissions, and whether cold days precede HF-related admissions in this cohort—should be declared in advance, with heat and cold retained and the full uncertainty display preserved.</w:t>
+      </w:r>
+    </w:p>
+    <w:bookmarkEnd w:id="38"/>
+    <w:bookmarkEnd w:id="39"/>
+    <w:bookmarkStart w:id="40" w:name="conclusion"/>
+    <w:p>
+      <w:pPr>
+        <w:pStyle w:val="Heading1"/>
+      </w:pPr>
+      <w:r>
+        <w:t xml:space="preserve">Conclusion</w:t>
+      </w:r>
+    </w:p>
+    <w:p>
+      <w:pPr>
+        <w:pStyle w:val="FirstParagraph"/>
+      </w:pPr>
+      <w:r>
+        <w:t xml:space="preserve">Between 2013 and 2023, Hong Kong experienced increasing hot-night burden while cold days persisted. In governed monthly data for people with diabetes and/or hypertension, CHD first-hospitalisation counts were more closely associated with hot nights, and HF counts with cold days, than with the other thermal measures examined. Neither association survived correction across twelve comparisons, and the CHD estimate depended on the uncertainty method and on including the pandemic years.</w:t>
+      </w:r>
+    </w:p>
+    <w:p>
+      <w:pPr>
+        <w:pStyle w:val="BodyText"/>
+      </w:pPr>
+      <w:r>
+        <w:t xml:space="preserve">The study therefore offers hypotheses, not proof of thermal effects. What it leaves behind is a precisely defined first-event outcome, a complete twelve-comparison panel, uncertainty shown under four methods, and a documented refusal to produce daily coefficients that monthly counts cannot support.</w:t>
       </w:r>
     </w:p>
     <w:bookmarkEnd w:id="40"/>
-    <w:bookmarkStart w:id="41" w:name="conclusion"/>
+    <w:bookmarkStart w:id="41" w:name="acknowledgements"/>
     <w:p>
       <w:pPr>
         <w:pStyle w:val="Heading1"/>
       </w:pPr>
       <w:r>
-        <w:t xml:space="preserve">Conclusion</w:t>
+        <w:t xml:space="preserve">Acknowledgements</w:t>
       </w:r>
     </w:p>
     <w:p>
@@ -3734,7 +4000,7 @@
         <w:pStyle w:val="FirstParagraph"/>
       </w:pPr>
       <w:r>
-        <w:t xml:space="preserve">Between 2013 and 2023, Hong Kong experienced increasing hot-night burden while cold days persisted. In governed monthly data for people with diabetes and/or hypertension, CHD first-hospitalisation counts were more closely associated with hot nights, and HF counts with cold days, than with the other thermal measures examined. Neither association survived correction across twelve comparisons, and the CHD estimate depended on the uncertainty method and on including the pandemic years.</w:t>
+        <w:t xml:space="preserve">I am especially grateful to Professor David Makram Bishai, who supervised this Laidlaw Scholars project. He set its scientific direction: a complete comparison of heat and cold encodings in one Hong Kong panel rather than a search for a single confirmatory association, with every comparison reported, uncertainty shown under more than one standard-error method, and the limits of monthly aggregates stated in the same document as the estimates. He advised on population-health interpretation of monthly counts and guided what may honestly be reported from governed Hospital Authority aggregates. The study sits within a School of Public Health programme he leads on temperature and health in Hong Kong, which also includes complementary modelled heatwave-mortality work. This report is submitted for the Laidlaw Stage 3 requirement under his supervision. Journal writing continues separately with the weather and health-data co-investigators. Remaining errors are mine.</w:t>
       </w:r>
     </w:p>
     <w:p>
@@ -3742,37 +4008,11 @@
         <w:pStyle w:val="BodyText"/>
       </w:pPr>
       <w:r>
-        <w:t xml:space="preserve">The study therefore offers hypotheses, not proof of thermal effects. What it leaves behind is a precisely defined first-event outcome, a complete twelve-comparison panel, uncertainty shown under four methods, and a documented refusal to produce daily coefficients that monthly counts cannot support.</w:t>
+        <w:t xml:space="preserve">I thank Hogan for guidance on weather definitions and on academic writing, and Zhenyuan Liu for constructing and releasing the governed Hospital Authority aggregates and for regression mentorship. Diagnosis-record construction was assisted by Dr Jingjing Zhou. Dissemination of governed results requires the approval of the team and the relevant institutions.</w:t>
       </w:r>
     </w:p>
     <w:bookmarkEnd w:id="41"/>
-    <w:bookmarkStart w:id="42" w:name="acknowledgements"/>
-    <w:p>
-      <w:pPr>
-        <w:pStyle w:val="Heading1"/>
-      </w:pPr>
-      <w:r>
-        <w:t xml:space="preserve">Acknowledgements</w:t>
-      </w:r>
-    </w:p>
-    <w:p>
-      <w:pPr>
-        <w:pStyle w:val="FirstParagraph"/>
-      </w:pPr>
-      <w:r>
-        <w:t xml:space="preserve">I am especially grateful to Professor David Makram Bishai, who supervised this Laidlaw Scholars project. He shaped the research question and the multi-method design; asked that heat and cold be carried together rather than as competing headlines; advised on population-health interpretation of monthly counts; and guided what may honestly be reported from governed Hospital Authority aggregates. This report is submitted for the Laidlaw Stage 3 requirement under his supervision. Journal writing continues separately with the weather and health-data co-investigators. Remaining errors are mine.</w:t>
-      </w:r>
-    </w:p>
-    <w:p>
-      <w:pPr>
-        <w:pStyle w:val="BodyText"/>
-      </w:pPr>
-      <w:r>
-        <w:t xml:space="preserve">I thank Hogan for guidance on weather definitions and on academic writing, and Zhenyuan Liu for constructing and releasing the governed Hospital Authority aggregates and for regression mentorship. Diagnosis-record construction was assisted by Dr Jingjing Zhou. Dissemination of governed results requires the approval of the team and the relevant institutions.</w:t>
-      </w:r>
-    </w:p>
-    <w:bookmarkEnd w:id="42"/>
-    <w:bookmarkStart w:id="43" w:name="appendix"/>
+    <w:bookmarkStart w:id="42" w:name="appendix"/>
     <w:p>
       <w:pPr>
         <w:pStyle w:val="Heading1"/>
@@ -3795,7 +4035,23 @@
           <w:b/>
           <w:sz w:val="20"/>
         </w:rPr>
-        <w:t xml:space="preserve">Table A1. Uncertainty ladder for the two leading exploratory contrasts.</w:t>
+        <w:t xml:space="preserve">Table A1.</w:t>
+      </w:r>
+      <w:r>
+        <w:rPr>
+          <w:rFonts w:ascii="Liberation Serif" w:hAnsi="Liberation Serif"/>
+          <w:b/>
+          <w:sz w:val="20"/>
+        </w:rPr>
+        <w:t xml:space="preserve"> </w:t>
+      </w:r>
+      <w:r>
+        <w:rPr>
+          <w:rFonts w:ascii="Liberation Serif" w:hAnsi="Liberation Serif"/>
+          <w:b/>
+          <w:sz w:val="20"/>
+        </w:rPr>
+        <w:t xml:space="preserve">Uncertainty ladder for the two leading exploratory contrasts.</w:t>
       </w:r>
     </w:p>
     <w:tbl>
@@ -3806,11 +4062,10 @@
         <w:tblLayout w:type="fixed"/>
       </w:tblPr>
       <w:tblGrid>
-        <w:gridCol w:w="2540"/>
-        <w:gridCol w:w="1632"/>
-        <w:gridCol w:w="1632"/>
-        <w:gridCol w:w="1632"/>
-        <w:gridCol w:w="1636"/>
+        <w:gridCol w:w="3265"/>
+        <w:gridCol w:w="2358"/>
+        <w:gridCol w:w="1270"/>
+        <w:gridCol w:w="2179"/>
       </w:tblGrid>
       <w:tr>
         <w:trPr>
@@ -3818,7 +4073,7 @@
         </w:trPr>
         <w:tc>
           <w:tcPr>
-            <w:tcW w:type="dxa" w:w="2540"/>
+            <w:tcW w:type="dxa" w:w="3265"/>
             <w:tcMar>
               <w:top w:w="40" w:type="dxa"/>
               <w:left w:w="60" w:type="dxa"/>
@@ -3851,7 +4106,7 @@
         </w:tc>
         <w:tc>
           <w:tcPr>
-            <w:tcW w:type="dxa" w:w="1632"/>
+            <w:tcW w:type="dxa" w:w="2358"/>
             <w:tcMar>
               <w:top w:w="40" w:type="dxa"/>
               <w:left w:w="60" w:type="dxa"/>
@@ -3878,13 +4133,13 @@
                 <w:color w:val="000000"/>
                 <w:sz w:val="20"/>
               </w:rPr>
-              <w:t xml:space="preserve">Model</w:t>
+              <w:t xml:space="preserve">Uncertainty method</w:t>
             </w:r>
           </w:p>
         </w:tc>
         <w:tc>
           <w:tcPr>
-            <w:tcW w:type="dxa" w:w="1632"/>
+            <w:tcW w:type="dxa" w:w="1270"/>
             <w:tcMar>
               <w:top w:w="40" w:type="dxa"/>
               <w:left w:w="60" w:type="dxa"/>
@@ -3911,13 +4166,13 @@
                 <w:color w:val="000000"/>
                 <w:sz w:val="20"/>
               </w:rPr>
-              <w:t xml:space="preserve">HC1</w:t>
+              <w:t xml:space="preserve">Count ratio</w:t>
             </w:r>
           </w:p>
         </w:tc>
         <w:tc>
           <w:tcPr>
-            <w:tcW w:type="dxa" w:w="1632"/>
+            <w:tcW w:type="dxa" w:w="2179"/>
             <w:tcMar>
               <w:top w:w="40" w:type="dxa"/>
               <w:left w:w="60" w:type="dxa"/>
@@ -3944,40 +4199,7 @@
                 <w:color w:val="000000"/>
                 <w:sz w:val="20"/>
               </w:rPr>
-              <w:t xml:space="preserve">NW3</w:t>
-            </w:r>
-          </w:p>
-        </w:tc>
-        <w:tc>
-          <w:tcPr>
-            <w:tcW w:type="dxa" w:w="1636"/>
-            <w:tcMar>
-              <w:top w:w="40" w:type="dxa"/>
-              <w:left w:w="60" w:type="dxa"/>
-              <w:bottom w:w="40" w:type="dxa"/>
-              <w:right w:w="60" w:type="dxa"/>
-            </w:tcMar>
-            <w:tcBorders>
-              <w:top w:val="single" w:sz="12" w:space="0" w:color="000000"/>
-              <w:bottom w:val="single" w:sz="8" w:space="0" w:color="000000"/>
-              <w:left w:val="nil"/>
-              <w:right w:val="nil"/>
-            </w:tcBorders>
-          </w:tcPr>
-          <w:p>
-            <w:pPr>
-              <w:pStyle w:val="Compact"/>
-              <w:spacing w:before="0" w:after="0" w:line="240" w:lineRule="auto"/>
-              <w:jc w:val="right"/>
-            </w:pPr>
-            <w:r>
-              <w:rPr>
-                <w:rFonts w:ascii="Liberation Serif" w:hAnsi="Liberation Serif"/>
-                <w:b/>
-                <w:color w:val="000000"/>
-                <w:sz w:val="20"/>
-              </w:rPr>
-              <w:t xml:space="preserve">NW6</w:t>
+              <w:t xml:space="preserve">95% CI</w:t>
             </w:r>
           </w:p>
         </w:tc>
@@ -3985,7 +4207,7 @@
       <w:tr>
         <w:tc>
           <w:tcPr>
-            <w:tcW w:type="dxa" w:w="2540"/>
+            <w:tcW w:type="dxa" w:w="3265"/>
             <w:tcMar>
               <w:top w:w="40" w:type="dxa"/>
               <w:left w:w="60" w:type="dxa"/>
@@ -4018,7 +4240,7 @@
         </w:tc>
         <w:tc>
           <w:tcPr>
-            <w:tcW w:type="dxa" w:w="1632"/>
+            <w:tcW w:type="dxa" w:w="2358"/>
             <w:tcMar>
               <w:top w:w="40" w:type="dxa"/>
               <w:left w:w="60" w:type="dxa"/>
@@ -4045,13 +4267,13 @@
                 <w:color w:val="000000"/>
                 <w:sz w:val="20"/>
               </w:rPr>
-              <w:t xml:space="preserve">1.022 (0.995–1.049)</w:t>
+              <w:t xml:space="preserve">Model-based</w:t>
             </w:r>
           </w:p>
         </w:tc>
         <w:tc>
           <w:tcPr>
-            <w:tcW w:type="dxa" w:w="1632"/>
+            <w:tcW w:type="dxa" w:w="1270"/>
             <w:tcMar>
               <w:top w:w="40" w:type="dxa"/>
               <w:left w:w="60" w:type="dxa"/>
@@ -4078,13 +4300,13 @@
                 <w:color w:val="000000"/>
                 <w:sz w:val="20"/>
               </w:rPr>
-              <w:t xml:space="preserve">1.022 (0.997–1.047)</w:t>
+              <w:t xml:space="preserve">1.022</w:t>
             </w:r>
           </w:p>
         </w:tc>
         <w:tc>
           <w:tcPr>
-            <w:tcW w:type="dxa" w:w="1632"/>
+            <w:tcW w:type="dxa" w:w="2179"/>
             <w:tcMar>
               <w:top w:w="40" w:type="dxa"/>
               <w:left w:w="60" w:type="dxa"/>
@@ -4111,13 +4333,48 @@
                 <w:color w:val="000000"/>
                 <w:sz w:val="20"/>
               </w:rPr>
-              <w:t xml:space="preserve">1.022 (1.0003–1.0439)</w:t>
+              <w:t xml:space="preserve">0.995–1.049</w:t>
+            </w:r>
+          </w:p>
+        </w:tc>
+      </w:tr>
+      <w:tr>
+        <w:tc>
+          <w:tcPr>
+            <w:tcW w:type="dxa" w:w="3265"/>
+            <w:tcMar>
+              <w:top w:w="40" w:type="dxa"/>
+              <w:left w:w="60" w:type="dxa"/>
+              <w:bottom w:w="40" w:type="dxa"/>
+              <w:right w:w="60" w:type="dxa"/>
+            </w:tcMar>
+            <w:tcBorders>
+              <w:top w:val="nil"/>
+              <w:bottom w:val="nil"/>
+              <w:left w:val="nil"/>
+              <w:right w:val="nil"/>
+            </w:tcBorders>
+          </w:tcPr>
+          <w:p>
+            <w:pPr>
+              <w:pStyle w:val="Compact"/>
+              <w:spacing w:before="0" w:after="0" w:line="240" w:lineRule="auto"/>
+              <w:jc w:val="left"/>
+            </w:pPr>
+            <w:r>
+              <w:rPr>
+                <w:rFonts w:ascii="Liberation Serif" w:hAnsi="Liberation Serif"/>
+                <w:b w:val="0"/>
+                <w:color w:val="000000"/>
+                <w:sz w:val="20"/>
+              </w:rPr>
+              <w:t xml:space="preserve">CHD hot nights / 5 days</w:t>
             </w:r>
           </w:p>
         </w:tc>
         <w:tc>
           <w:tcPr>
-            <w:tcW w:type="dxa" w:w="1636"/>
+            <w:tcW w:type="dxa" w:w="2358"/>
             <w:tcMar>
               <w:top w:w="40" w:type="dxa"/>
               <w:left w:w="60" w:type="dxa"/>
@@ -4144,7 +4401,73 @@
                 <w:color w:val="000000"/>
                 <w:sz w:val="20"/>
               </w:rPr>
-              <w:t xml:space="preserve">1.022 (1.002–1.042)</w:t>
+              <w:t xml:space="preserve">HC1</w:t>
+            </w:r>
+          </w:p>
+        </w:tc>
+        <w:tc>
+          <w:tcPr>
+            <w:tcW w:type="dxa" w:w="1270"/>
+            <w:tcMar>
+              <w:top w:w="40" w:type="dxa"/>
+              <w:left w:w="60" w:type="dxa"/>
+              <w:bottom w:w="40" w:type="dxa"/>
+              <w:right w:w="60" w:type="dxa"/>
+            </w:tcMar>
+            <w:tcBorders>
+              <w:top w:val="nil"/>
+              <w:bottom w:val="nil"/>
+              <w:left w:val="nil"/>
+              <w:right w:val="nil"/>
+            </w:tcBorders>
+          </w:tcPr>
+          <w:p>
+            <w:pPr>
+              <w:pStyle w:val="Compact"/>
+              <w:spacing w:before="0" w:after="0" w:line="240" w:lineRule="auto"/>
+              <w:jc w:val="right"/>
+            </w:pPr>
+            <w:r>
+              <w:rPr>
+                <w:rFonts w:ascii="Liberation Serif" w:hAnsi="Liberation Serif"/>
+                <w:b w:val="0"/>
+                <w:color w:val="000000"/>
+                <w:sz w:val="20"/>
+              </w:rPr>
+              <w:t xml:space="preserve">1.022</w:t>
+            </w:r>
+          </w:p>
+        </w:tc>
+        <w:tc>
+          <w:tcPr>
+            <w:tcW w:type="dxa" w:w="2179"/>
+            <w:tcMar>
+              <w:top w:w="40" w:type="dxa"/>
+              <w:left w:w="60" w:type="dxa"/>
+              <w:bottom w:w="40" w:type="dxa"/>
+              <w:right w:w="60" w:type="dxa"/>
+            </w:tcMar>
+            <w:tcBorders>
+              <w:top w:val="nil"/>
+              <w:bottom w:val="nil"/>
+              <w:left w:val="nil"/>
+              <w:right w:val="nil"/>
+            </w:tcBorders>
+          </w:tcPr>
+          <w:p>
+            <w:pPr>
+              <w:pStyle w:val="Compact"/>
+              <w:spacing w:before="0" w:after="0" w:line="240" w:lineRule="auto"/>
+              <w:jc w:val="right"/>
+            </w:pPr>
+            <w:r>
+              <w:rPr>
+                <w:rFonts w:ascii="Liberation Serif" w:hAnsi="Liberation Serif"/>
+                <w:b w:val="0"/>
+                <w:color w:val="000000"/>
+                <w:sz w:val="20"/>
+              </w:rPr>
+              <w:t xml:space="preserve">0.997–1.047</w:t>
             </w:r>
           </w:p>
         </w:tc>
@@ -4152,7 +4475,677 @@
       <w:tr>
         <w:tc>
           <w:tcPr>
-            <w:tcW w:type="dxa" w:w="2540"/>
+            <w:tcW w:type="dxa" w:w="3265"/>
+            <w:tcMar>
+              <w:top w:w="40" w:type="dxa"/>
+              <w:left w:w="60" w:type="dxa"/>
+              <w:bottom w:w="40" w:type="dxa"/>
+              <w:right w:w="60" w:type="dxa"/>
+            </w:tcMar>
+            <w:tcBorders>
+              <w:top w:val="nil"/>
+              <w:bottom w:val="nil"/>
+              <w:left w:val="nil"/>
+              <w:right w:val="nil"/>
+            </w:tcBorders>
+          </w:tcPr>
+          <w:p>
+            <w:pPr>
+              <w:pStyle w:val="Compact"/>
+              <w:spacing w:before="0" w:after="0" w:line="240" w:lineRule="auto"/>
+              <w:jc w:val="left"/>
+            </w:pPr>
+            <w:r>
+              <w:rPr>
+                <w:rFonts w:ascii="Liberation Serif" w:hAnsi="Liberation Serif"/>
+                <w:b w:val="0"/>
+                <w:color w:val="000000"/>
+                <w:sz w:val="20"/>
+              </w:rPr>
+              <w:t xml:space="preserve">CHD hot nights / 5 days</w:t>
+            </w:r>
+          </w:p>
+        </w:tc>
+        <w:tc>
+          <w:tcPr>
+            <w:tcW w:type="dxa" w:w="2358"/>
+            <w:tcMar>
+              <w:top w:w="40" w:type="dxa"/>
+              <w:left w:w="60" w:type="dxa"/>
+              <w:bottom w:w="40" w:type="dxa"/>
+              <w:right w:w="60" w:type="dxa"/>
+            </w:tcMar>
+            <w:tcBorders>
+              <w:top w:val="nil"/>
+              <w:bottom w:val="nil"/>
+              <w:left w:val="nil"/>
+              <w:right w:val="nil"/>
+            </w:tcBorders>
+          </w:tcPr>
+          <w:p>
+            <w:pPr>
+              <w:pStyle w:val="Compact"/>
+              <w:spacing w:before="0" w:after="0" w:line="240" w:lineRule="auto"/>
+              <w:jc w:val="right"/>
+            </w:pPr>
+            <w:r>
+              <w:rPr>
+                <w:rFonts w:ascii="Liberation Serif" w:hAnsi="Liberation Serif"/>
+                <w:b w:val="0"/>
+                <w:color w:val="000000"/>
+                <w:sz w:val="20"/>
+              </w:rPr>
+              <w:t xml:space="preserve">Newey–West lag 3</w:t>
+            </w:r>
+          </w:p>
+        </w:tc>
+        <w:tc>
+          <w:tcPr>
+            <w:tcW w:type="dxa" w:w="1270"/>
+            <w:tcMar>
+              <w:top w:w="40" w:type="dxa"/>
+              <w:left w:w="60" w:type="dxa"/>
+              <w:bottom w:w="40" w:type="dxa"/>
+              <w:right w:w="60" w:type="dxa"/>
+            </w:tcMar>
+            <w:tcBorders>
+              <w:top w:val="nil"/>
+              <w:bottom w:val="nil"/>
+              <w:left w:val="nil"/>
+              <w:right w:val="nil"/>
+            </w:tcBorders>
+          </w:tcPr>
+          <w:p>
+            <w:pPr>
+              <w:pStyle w:val="Compact"/>
+              <w:spacing w:before="0" w:after="0" w:line="240" w:lineRule="auto"/>
+              <w:jc w:val="right"/>
+            </w:pPr>
+            <w:r>
+              <w:rPr>
+                <w:rFonts w:ascii="Liberation Serif" w:hAnsi="Liberation Serif"/>
+                <w:b w:val="0"/>
+                <w:color w:val="000000"/>
+                <w:sz w:val="20"/>
+              </w:rPr>
+              <w:t xml:space="preserve">1.022</w:t>
+            </w:r>
+          </w:p>
+        </w:tc>
+        <w:tc>
+          <w:tcPr>
+            <w:tcW w:type="dxa" w:w="2179"/>
+            <w:tcMar>
+              <w:top w:w="40" w:type="dxa"/>
+              <w:left w:w="60" w:type="dxa"/>
+              <w:bottom w:w="40" w:type="dxa"/>
+              <w:right w:w="60" w:type="dxa"/>
+            </w:tcMar>
+            <w:tcBorders>
+              <w:top w:val="nil"/>
+              <w:bottom w:val="nil"/>
+              <w:left w:val="nil"/>
+              <w:right w:val="nil"/>
+            </w:tcBorders>
+          </w:tcPr>
+          <w:p>
+            <w:pPr>
+              <w:pStyle w:val="Compact"/>
+              <w:spacing w:before="0" w:after="0" w:line="240" w:lineRule="auto"/>
+              <w:jc w:val="right"/>
+            </w:pPr>
+            <w:r>
+              <w:rPr>
+                <w:rFonts w:ascii="Liberation Serif" w:hAnsi="Liberation Serif"/>
+                <w:b w:val="0"/>
+                <w:color w:val="000000"/>
+                <w:sz w:val="20"/>
+              </w:rPr>
+              <w:t xml:space="preserve">1.0003–1.0439</w:t>
+            </w:r>
+          </w:p>
+        </w:tc>
+      </w:tr>
+      <w:tr>
+        <w:tc>
+          <w:tcPr>
+            <w:tcW w:type="dxa" w:w="3265"/>
+            <w:tcMar>
+              <w:top w:w="40" w:type="dxa"/>
+              <w:left w:w="60" w:type="dxa"/>
+              <w:bottom w:w="40" w:type="dxa"/>
+              <w:right w:w="60" w:type="dxa"/>
+            </w:tcMar>
+            <w:tcBorders>
+              <w:top w:val="nil"/>
+              <w:bottom w:val="nil"/>
+              <w:left w:val="nil"/>
+              <w:right w:val="nil"/>
+            </w:tcBorders>
+          </w:tcPr>
+          <w:p>
+            <w:pPr>
+              <w:pStyle w:val="Compact"/>
+              <w:spacing w:before="0" w:after="0" w:line="240" w:lineRule="auto"/>
+              <w:jc w:val="left"/>
+            </w:pPr>
+            <w:r>
+              <w:rPr>
+                <w:rFonts w:ascii="Liberation Serif" w:hAnsi="Liberation Serif"/>
+                <w:b w:val="0"/>
+                <w:color w:val="000000"/>
+                <w:sz w:val="20"/>
+              </w:rPr>
+              <w:t xml:space="preserve">CHD hot nights / 5 days</w:t>
+            </w:r>
+          </w:p>
+        </w:tc>
+        <w:tc>
+          <w:tcPr>
+            <w:tcW w:type="dxa" w:w="2358"/>
+            <w:tcMar>
+              <w:top w:w="40" w:type="dxa"/>
+              <w:left w:w="60" w:type="dxa"/>
+              <w:bottom w:w="40" w:type="dxa"/>
+              <w:right w:w="60" w:type="dxa"/>
+            </w:tcMar>
+            <w:tcBorders>
+              <w:top w:val="nil"/>
+              <w:bottom w:val="nil"/>
+              <w:left w:val="nil"/>
+              <w:right w:val="nil"/>
+            </w:tcBorders>
+          </w:tcPr>
+          <w:p>
+            <w:pPr>
+              <w:pStyle w:val="Compact"/>
+              <w:spacing w:before="0" w:after="0" w:line="240" w:lineRule="auto"/>
+              <w:jc w:val="right"/>
+            </w:pPr>
+            <w:r>
+              <w:rPr>
+                <w:rFonts w:ascii="Liberation Serif" w:hAnsi="Liberation Serif"/>
+                <w:b w:val="0"/>
+                <w:color w:val="000000"/>
+                <w:sz w:val="20"/>
+              </w:rPr>
+              <w:t xml:space="preserve">Newey–West lag 6</w:t>
+            </w:r>
+          </w:p>
+        </w:tc>
+        <w:tc>
+          <w:tcPr>
+            <w:tcW w:type="dxa" w:w="1270"/>
+            <w:tcMar>
+              <w:top w:w="40" w:type="dxa"/>
+              <w:left w:w="60" w:type="dxa"/>
+              <w:bottom w:w="40" w:type="dxa"/>
+              <w:right w:w="60" w:type="dxa"/>
+            </w:tcMar>
+            <w:tcBorders>
+              <w:top w:val="nil"/>
+              <w:bottom w:val="nil"/>
+              <w:left w:val="nil"/>
+              <w:right w:val="nil"/>
+            </w:tcBorders>
+          </w:tcPr>
+          <w:p>
+            <w:pPr>
+              <w:pStyle w:val="Compact"/>
+              <w:spacing w:before="0" w:after="0" w:line="240" w:lineRule="auto"/>
+              <w:jc w:val="right"/>
+            </w:pPr>
+            <w:r>
+              <w:rPr>
+                <w:rFonts w:ascii="Liberation Serif" w:hAnsi="Liberation Serif"/>
+                <w:b w:val="0"/>
+                <w:color w:val="000000"/>
+                <w:sz w:val="20"/>
+              </w:rPr>
+              <w:t xml:space="preserve">1.022</w:t>
+            </w:r>
+          </w:p>
+        </w:tc>
+        <w:tc>
+          <w:tcPr>
+            <w:tcW w:type="dxa" w:w="2179"/>
+            <w:tcMar>
+              <w:top w:w="40" w:type="dxa"/>
+              <w:left w:w="60" w:type="dxa"/>
+              <w:bottom w:w="40" w:type="dxa"/>
+              <w:right w:w="60" w:type="dxa"/>
+            </w:tcMar>
+            <w:tcBorders>
+              <w:top w:val="nil"/>
+              <w:bottom w:val="nil"/>
+              <w:left w:val="nil"/>
+              <w:right w:val="nil"/>
+            </w:tcBorders>
+          </w:tcPr>
+          <w:p>
+            <w:pPr>
+              <w:pStyle w:val="Compact"/>
+              <w:spacing w:before="0" w:after="0" w:line="240" w:lineRule="auto"/>
+              <w:jc w:val="right"/>
+            </w:pPr>
+            <w:r>
+              <w:rPr>
+                <w:rFonts w:ascii="Liberation Serif" w:hAnsi="Liberation Serif"/>
+                <w:b w:val="0"/>
+                <w:color w:val="000000"/>
+                <w:sz w:val="20"/>
+              </w:rPr>
+              <w:t xml:space="preserve">1.002–1.042</w:t>
+            </w:r>
+          </w:p>
+        </w:tc>
+      </w:tr>
+      <w:tr>
+        <w:tc>
+          <w:tcPr>
+            <w:tcW w:type="dxa" w:w="3265"/>
+            <w:tcMar>
+              <w:top w:w="40" w:type="dxa"/>
+              <w:left w:w="60" w:type="dxa"/>
+              <w:bottom w:w="40" w:type="dxa"/>
+              <w:right w:w="60" w:type="dxa"/>
+            </w:tcMar>
+            <w:tcBorders>
+              <w:top w:val="nil"/>
+              <w:bottom w:val="nil"/>
+              <w:left w:val="nil"/>
+              <w:right w:val="nil"/>
+            </w:tcBorders>
+          </w:tcPr>
+          <w:p>
+            <w:pPr>
+              <w:pStyle w:val="Compact"/>
+              <w:spacing w:before="0" w:after="0" w:line="240" w:lineRule="auto"/>
+              <w:jc w:val="left"/>
+            </w:pPr>
+            <w:r>
+              <w:rPr>
+                <w:rFonts w:ascii="Liberation Serif" w:hAnsi="Liberation Serif"/>
+                <w:b w:val="0"/>
+                <w:color w:val="000000"/>
+                <w:sz w:val="20"/>
+              </w:rPr>
+              <w:t xml:space="preserve">HF cold days / 5 days</w:t>
+            </w:r>
+          </w:p>
+        </w:tc>
+        <w:tc>
+          <w:tcPr>
+            <w:tcW w:type="dxa" w:w="2358"/>
+            <w:tcMar>
+              <w:top w:w="40" w:type="dxa"/>
+              <w:left w:w="60" w:type="dxa"/>
+              <w:bottom w:w="40" w:type="dxa"/>
+              <w:right w:w="60" w:type="dxa"/>
+            </w:tcMar>
+            <w:tcBorders>
+              <w:top w:val="nil"/>
+              <w:bottom w:val="nil"/>
+              <w:left w:val="nil"/>
+              <w:right w:val="nil"/>
+            </w:tcBorders>
+          </w:tcPr>
+          <w:p>
+            <w:pPr>
+              <w:pStyle w:val="Compact"/>
+              <w:spacing w:before="0" w:after="0" w:line="240" w:lineRule="auto"/>
+              <w:jc w:val="right"/>
+            </w:pPr>
+            <w:r>
+              <w:rPr>
+                <w:rFonts w:ascii="Liberation Serif" w:hAnsi="Liberation Serif"/>
+                <w:b w:val="0"/>
+                <w:color w:val="000000"/>
+                <w:sz w:val="20"/>
+              </w:rPr>
+              <w:t xml:space="preserve">Model-based</w:t>
+            </w:r>
+          </w:p>
+        </w:tc>
+        <w:tc>
+          <w:tcPr>
+            <w:tcW w:type="dxa" w:w="1270"/>
+            <w:tcMar>
+              <w:top w:w="40" w:type="dxa"/>
+              <w:left w:w="60" w:type="dxa"/>
+              <w:bottom w:w="40" w:type="dxa"/>
+              <w:right w:w="60" w:type="dxa"/>
+            </w:tcMar>
+            <w:tcBorders>
+              <w:top w:val="nil"/>
+              <w:bottom w:val="nil"/>
+              <w:left w:val="nil"/>
+              <w:right w:val="nil"/>
+            </w:tcBorders>
+          </w:tcPr>
+          <w:p>
+            <w:pPr>
+              <w:pStyle w:val="Compact"/>
+              <w:spacing w:before="0" w:after="0" w:line="240" w:lineRule="auto"/>
+              <w:jc w:val="right"/>
+            </w:pPr>
+            <w:r>
+              <w:rPr>
+                <w:rFonts w:ascii="Liberation Serif" w:hAnsi="Liberation Serif"/>
+                <w:b w:val="0"/>
+                <w:color w:val="000000"/>
+                <w:sz w:val="20"/>
+              </w:rPr>
+              <w:t xml:space="preserve">1.073</w:t>
+            </w:r>
+          </w:p>
+        </w:tc>
+        <w:tc>
+          <w:tcPr>
+            <w:tcW w:type="dxa" w:w="2179"/>
+            <w:tcMar>
+              <w:top w:w="40" w:type="dxa"/>
+              <w:left w:w="60" w:type="dxa"/>
+              <w:bottom w:w="40" w:type="dxa"/>
+              <w:right w:w="60" w:type="dxa"/>
+            </w:tcMar>
+            <w:tcBorders>
+              <w:top w:val="nil"/>
+              <w:bottom w:val="nil"/>
+              <w:left w:val="nil"/>
+              <w:right w:val="nil"/>
+            </w:tcBorders>
+          </w:tcPr>
+          <w:p>
+            <w:pPr>
+              <w:pStyle w:val="Compact"/>
+              <w:spacing w:before="0" w:after="0" w:line="240" w:lineRule="auto"/>
+              <w:jc w:val="right"/>
+            </w:pPr>
+            <w:r>
+              <w:rPr>
+                <w:rFonts w:ascii="Liberation Serif" w:hAnsi="Liberation Serif"/>
+                <w:b w:val="0"/>
+                <w:color w:val="000000"/>
+                <w:sz w:val="20"/>
+              </w:rPr>
+              <w:t xml:space="preserve">1.023–1.125</w:t>
+            </w:r>
+          </w:p>
+        </w:tc>
+      </w:tr>
+      <w:tr>
+        <w:tc>
+          <w:tcPr>
+            <w:tcW w:type="dxa" w:w="3265"/>
+            <w:tcMar>
+              <w:top w:w="40" w:type="dxa"/>
+              <w:left w:w="60" w:type="dxa"/>
+              <w:bottom w:w="40" w:type="dxa"/>
+              <w:right w:w="60" w:type="dxa"/>
+            </w:tcMar>
+            <w:tcBorders>
+              <w:top w:val="nil"/>
+              <w:bottom w:val="nil"/>
+              <w:left w:val="nil"/>
+              <w:right w:val="nil"/>
+            </w:tcBorders>
+          </w:tcPr>
+          <w:p>
+            <w:pPr>
+              <w:pStyle w:val="Compact"/>
+              <w:spacing w:before="0" w:after="0" w:line="240" w:lineRule="auto"/>
+              <w:jc w:val="left"/>
+            </w:pPr>
+            <w:r>
+              <w:rPr>
+                <w:rFonts w:ascii="Liberation Serif" w:hAnsi="Liberation Serif"/>
+                <w:b w:val="0"/>
+                <w:color w:val="000000"/>
+                <w:sz w:val="20"/>
+              </w:rPr>
+              <w:t xml:space="preserve">HF cold days / 5 days</w:t>
+            </w:r>
+          </w:p>
+        </w:tc>
+        <w:tc>
+          <w:tcPr>
+            <w:tcW w:type="dxa" w:w="2358"/>
+            <w:tcMar>
+              <w:top w:w="40" w:type="dxa"/>
+              <w:left w:w="60" w:type="dxa"/>
+              <w:bottom w:w="40" w:type="dxa"/>
+              <w:right w:w="60" w:type="dxa"/>
+            </w:tcMar>
+            <w:tcBorders>
+              <w:top w:val="nil"/>
+              <w:bottom w:val="nil"/>
+              <w:left w:val="nil"/>
+              <w:right w:val="nil"/>
+            </w:tcBorders>
+          </w:tcPr>
+          <w:p>
+            <w:pPr>
+              <w:pStyle w:val="Compact"/>
+              <w:spacing w:before="0" w:after="0" w:line="240" w:lineRule="auto"/>
+              <w:jc w:val="right"/>
+            </w:pPr>
+            <w:r>
+              <w:rPr>
+                <w:rFonts w:ascii="Liberation Serif" w:hAnsi="Liberation Serif"/>
+                <w:b w:val="0"/>
+                <w:color w:val="000000"/>
+                <w:sz w:val="20"/>
+              </w:rPr>
+              <w:t xml:space="preserve">HC1</w:t>
+            </w:r>
+          </w:p>
+        </w:tc>
+        <w:tc>
+          <w:tcPr>
+            <w:tcW w:type="dxa" w:w="1270"/>
+            <w:tcMar>
+              <w:top w:w="40" w:type="dxa"/>
+              <w:left w:w="60" w:type="dxa"/>
+              <w:bottom w:w="40" w:type="dxa"/>
+              <w:right w:w="60" w:type="dxa"/>
+            </w:tcMar>
+            <w:tcBorders>
+              <w:top w:val="nil"/>
+              <w:bottom w:val="nil"/>
+              <w:left w:val="nil"/>
+              <w:right w:val="nil"/>
+            </w:tcBorders>
+          </w:tcPr>
+          <w:p>
+            <w:pPr>
+              <w:pStyle w:val="Compact"/>
+              <w:spacing w:before="0" w:after="0" w:line="240" w:lineRule="auto"/>
+              <w:jc w:val="right"/>
+            </w:pPr>
+            <w:r>
+              <w:rPr>
+                <w:rFonts w:ascii="Liberation Serif" w:hAnsi="Liberation Serif"/>
+                <w:b w:val="0"/>
+                <w:color w:val="000000"/>
+                <w:sz w:val="20"/>
+              </w:rPr>
+              <w:t xml:space="preserve">1.073</w:t>
+            </w:r>
+          </w:p>
+        </w:tc>
+        <w:tc>
+          <w:tcPr>
+            <w:tcW w:type="dxa" w:w="2179"/>
+            <w:tcMar>
+              <w:top w:w="40" w:type="dxa"/>
+              <w:left w:w="60" w:type="dxa"/>
+              <w:bottom w:w="40" w:type="dxa"/>
+              <w:right w:w="60" w:type="dxa"/>
+            </w:tcMar>
+            <w:tcBorders>
+              <w:top w:val="nil"/>
+              <w:bottom w:val="nil"/>
+              <w:left w:val="nil"/>
+              <w:right w:val="nil"/>
+            </w:tcBorders>
+          </w:tcPr>
+          <w:p>
+            <w:pPr>
+              <w:pStyle w:val="Compact"/>
+              <w:spacing w:before="0" w:after="0" w:line="240" w:lineRule="auto"/>
+              <w:jc w:val="right"/>
+            </w:pPr>
+            <w:r>
+              <w:rPr>
+                <w:rFonts w:ascii="Liberation Serif" w:hAnsi="Liberation Serif"/>
+                <w:b w:val="0"/>
+                <w:color w:val="000000"/>
+                <w:sz w:val="20"/>
+              </w:rPr>
+              <w:t xml:space="preserve">1.011–1.138</w:t>
+            </w:r>
+          </w:p>
+        </w:tc>
+      </w:tr>
+      <w:tr>
+        <w:tc>
+          <w:tcPr>
+            <w:tcW w:type="dxa" w:w="3265"/>
+            <w:tcMar>
+              <w:top w:w="40" w:type="dxa"/>
+              <w:left w:w="60" w:type="dxa"/>
+              <w:bottom w:w="40" w:type="dxa"/>
+              <w:right w:w="60" w:type="dxa"/>
+            </w:tcMar>
+            <w:tcBorders>
+              <w:top w:val="nil"/>
+              <w:bottom w:val="nil"/>
+              <w:left w:val="nil"/>
+              <w:right w:val="nil"/>
+            </w:tcBorders>
+          </w:tcPr>
+          <w:p>
+            <w:pPr>
+              <w:pStyle w:val="Compact"/>
+              <w:spacing w:before="0" w:after="0" w:line="240" w:lineRule="auto"/>
+              <w:jc w:val="left"/>
+            </w:pPr>
+            <w:r>
+              <w:rPr>
+                <w:rFonts w:ascii="Liberation Serif" w:hAnsi="Liberation Serif"/>
+                <w:b w:val="0"/>
+                <w:color w:val="000000"/>
+                <w:sz w:val="20"/>
+              </w:rPr>
+              <w:t xml:space="preserve">HF cold days / 5 days</w:t>
+            </w:r>
+          </w:p>
+        </w:tc>
+        <w:tc>
+          <w:tcPr>
+            <w:tcW w:type="dxa" w:w="2358"/>
+            <w:tcMar>
+              <w:top w:w="40" w:type="dxa"/>
+              <w:left w:w="60" w:type="dxa"/>
+              <w:bottom w:w="40" w:type="dxa"/>
+              <w:right w:w="60" w:type="dxa"/>
+            </w:tcMar>
+            <w:tcBorders>
+              <w:top w:val="nil"/>
+              <w:bottom w:val="nil"/>
+              <w:left w:val="nil"/>
+              <w:right w:val="nil"/>
+            </w:tcBorders>
+          </w:tcPr>
+          <w:p>
+            <w:pPr>
+              <w:pStyle w:val="Compact"/>
+              <w:spacing w:before="0" w:after="0" w:line="240" w:lineRule="auto"/>
+              <w:jc w:val="right"/>
+            </w:pPr>
+            <w:r>
+              <w:rPr>
+                <w:rFonts w:ascii="Liberation Serif" w:hAnsi="Liberation Serif"/>
+                <w:b w:val="0"/>
+                <w:color w:val="000000"/>
+                <w:sz w:val="20"/>
+              </w:rPr>
+              <w:t xml:space="preserve">Newey–West lag 3</w:t>
+            </w:r>
+          </w:p>
+        </w:tc>
+        <w:tc>
+          <w:tcPr>
+            <w:tcW w:type="dxa" w:w="1270"/>
+            <w:tcMar>
+              <w:top w:w="40" w:type="dxa"/>
+              <w:left w:w="60" w:type="dxa"/>
+              <w:bottom w:w="40" w:type="dxa"/>
+              <w:right w:w="60" w:type="dxa"/>
+            </w:tcMar>
+            <w:tcBorders>
+              <w:top w:val="nil"/>
+              <w:bottom w:val="nil"/>
+              <w:left w:val="nil"/>
+              <w:right w:val="nil"/>
+            </w:tcBorders>
+          </w:tcPr>
+          <w:p>
+            <w:pPr>
+              <w:pStyle w:val="Compact"/>
+              <w:spacing w:before="0" w:after="0" w:line="240" w:lineRule="auto"/>
+              <w:jc w:val="right"/>
+            </w:pPr>
+            <w:r>
+              <w:rPr>
+                <w:rFonts w:ascii="Liberation Serif" w:hAnsi="Liberation Serif"/>
+                <w:b w:val="0"/>
+                <w:color w:val="000000"/>
+                <w:sz w:val="20"/>
+              </w:rPr>
+              <w:t xml:space="preserve">1.073</w:t>
+            </w:r>
+          </w:p>
+        </w:tc>
+        <w:tc>
+          <w:tcPr>
+            <w:tcW w:type="dxa" w:w="2179"/>
+            <w:tcMar>
+              <w:top w:w="40" w:type="dxa"/>
+              <w:left w:w="60" w:type="dxa"/>
+              <w:bottom w:w="40" w:type="dxa"/>
+              <w:right w:w="60" w:type="dxa"/>
+            </w:tcMar>
+            <w:tcBorders>
+              <w:top w:val="nil"/>
+              <w:bottom w:val="nil"/>
+              <w:left w:val="nil"/>
+              <w:right w:val="nil"/>
+            </w:tcBorders>
+          </w:tcPr>
+          <w:p>
+            <w:pPr>
+              <w:pStyle w:val="Compact"/>
+              <w:spacing w:before="0" w:after="0" w:line="240" w:lineRule="auto"/>
+              <w:jc w:val="right"/>
+            </w:pPr>
+            <w:r>
+              <w:rPr>
+                <w:rFonts w:ascii="Liberation Serif" w:hAnsi="Liberation Serif"/>
+                <w:b w:val="0"/>
+                <w:color w:val="000000"/>
+                <w:sz w:val="20"/>
+              </w:rPr>
+              <w:t xml:space="preserve">1.007–1.143</w:t>
+            </w:r>
+          </w:p>
+        </w:tc>
+      </w:tr>
+      <w:tr>
+        <w:tc>
+          <w:tcPr>
+            <w:tcW w:type="dxa" w:w="3265"/>
             <w:tcMar>
               <w:top w:w="40" w:type="dxa"/>
               <w:left w:w="60" w:type="dxa"/>
@@ -4185,7 +5178,7 @@
         </w:tc>
         <w:tc>
           <w:tcPr>
-            <w:tcW w:type="dxa" w:w="1632"/>
+            <w:tcW w:type="dxa" w:w="2358"/>
             <w:tcMar>
               <w:top w:w="40" w:type="dxa"/>
               <w:left w:w="60" w:type="dxa"/>
@@ -4212,13 +5205,13 @@
                 <w:color w:val="000000"/>
                 <w:sz w:val="20"/>
               </w:rPr>
-              <w:t xml:space="preserve">1.073 (1.023–1.125)</w:t>
+              <w:t xml:space="preserve">Newey–West lag 6</w:t>
             </w:r>
           </w:p>
         </w:tc>
         <w:tc>
           <w:tcPr>
-            <w:tcW w:type="dxa" w:w="1632"/>
+            <w:tcW w:type="dxa" w:w="1270"/>
             <w:tcMar>
               <w:top w:w="40" w:type="dxa"/>
               <w:left w:w="60" w:type="dxa"/>
@@ -4245,13 +5238,13 @@
                 <w:color w:val="000000"/>
                 <w:sz w:val="20"/>
               </w:rPr>
-              <w:t xml:space="preserve">1.073 (1.011–1.138)</w:t>
+              <w:t xml:space="preserve">1.073</w:t>
             </w:r>
           </w:p>
         </w:tc>
         <w:tc>
           <w:tcPr>
-            <w:tcW w:type="dxa" w:w="1632"/>
+            <w:tcW w:type="dxa" w:w="2179"/>
             <w:tcMar>
               <w:top w:w="40" w:type="dxa"/>
               <w:left w:w="60" w:type="dxa"/>
@@ -4278,40 +5271,7 @@
                 <w:color w:val="000000"/>
                 <w:sz w:val="20"/>
               </w:rPr>
-              <w:t xml:space="preserve">1.073 (1.007–1.143)</w:t>
-            </w:r>
-          </w:p>
-        </w:tc>
-        <w:tc>
-          <w:tcPr>
-            <w:tcW w:type="dxa" w:w="1636"/>
-            <w:tcMar>
-              <w:top w:w="40" w:type="dxa"/>
-              <w:left w:w="60" w:type="dxa"/>
-              <w:bottom w:w="40" w:type="dxa"/>
-              <w:right w:w="60" w:type="dxa"/>
-            </w:tcMar>
-            <w:tcBorders>
-              <w:top w:val="nil"/>
-              <w:bottom w:val="single" w:sz="12" w:space="0" w:color="000000"/>
-              <w:left w:val="nil"/>
-              <w:right w:val="nil"/>
-            </w:tcBorders>
-          </w:tcPr>
-          <w:p>
-            <w:pPr>
-              <w:pStyle w:val="Compact"/>
-              <w:spacing w:before="0" w:after="0" w:line="240" w:lineRule="auto"/>
-              <w:jc w:val="right"/>
-            </w:pPr>
-            <w:r>
-              <w:rPr>
-                <w:rFonts w:ascii="Liberation Serif" w:hAnsi="Liberation Serif"/>
-                <w:b w:val="0"/>
-                <w:color w:val="000000"/>
-                <w:sz w:val="20"/>
-              </w:rPr>
-              <w:t xml:space="preserve">1.073 (1.006–1.144)</w:t>
+              <w:t xml:space="preserve">1.006–1.144</w:t>
             </w:r>
           </w:p>
         </w:tc>
@@ -4366,8 +5326,8 @@
         <w:t xml:space="preserve">. In the most difficult cells, false-positive rates reached 0.150, confidence-interval coverage fell to 0.840, and sign recovery was poor for moderate effects. Admission of any real daily coefficient required all frozen calibration criteria to pass. They did not. This is a project-specific calibration result, not a general indictment of the method. A full daily distributed-lag non-linear model is not identified from 132 monthly sums.</w:t>
       </w:r>
     </w:p>
-    <w:bookmarkEnd w:id="43"/>
-    <w:bookmarkStart w:id="81" w:name="bibliography"/>
+    <w:bookmarkEnd w:id="42"/>
+    <w:bookmarkStart w:id="80" w:name="bibliography"/>
     <w:p>
       <w:pPr>
         <w:pStyle w:val="Heading1"/>
@@ -4376,8 +5336,8 @@
         <w:t xml:space="preserve">References</w:t>
       </w:r>
     </w:p>
-    <w:bookmarkStart w:id="80" w:name="refs"/>
-    <w:bookmarkStart w:id="45" w:name="ref-liu2026roro"/>
+    <w:bookmarkStart w:id="79" w:name="refs"/>
+    <w:bookmarkStart w:id="44" w:name="ref-hko2013"/>
     <w:p>
       <w:pPr>
         <w:pStyle w:val="Bibliography"/>
@@ -4392,6 +5352,309 @@
         <w:t xml:space="preserve">	</w:t>
       </w:r>
       <w:r>
+        <w:t xml:space="preserve">Hong Kong Observatory. The year’s weather – 2013 [Internet]. 2014. Available from:</w:t>
+      </w:r>
+      <w:r>
+        <w:t xml:space="preserve"> </w:t>
+      </w:r>
+      <w:hyperlink r:id="rId43">
+        <w:r>
+          <w:rPr>
+            <w:rStyle w:val="Hyperlink"/>
+          </w:rPr>
+          <w:t xml:space="preserve">https://www.hko.gov.hk/en/wxinfo/pastwx/ywx2013.htm</w:t>
+        </w:r>
+      </w:hyperlink>
+    </w:p>
+    <w:bookmarkEnd w:id="44"/>
+    <w:bookmarkStart w:id="46" w:name="ref-hko2021"/>
+    <w:p>
+      <w:pPr>
+        <w:pStyle w:val="Bibliography"/>
+      </w:pPr>
+      <w:r>
+        <w:t xml:space="preserve">2.</w:t>
+      </w:r>
+      <w:r>
+        <w:t xml:space="preserve"> </w:t>
+      </w:r>
+      <w:r>
+        <w:t xml:space="preserve">	</w:t>
+      </w:r>
+      <w:r>
+        <w:t xml:space="preserve">Hong Kong Observatory. The year’s weather – 2021 [Internet]. 2022. Available from:</w:t>
+      </w:r>
+      <w:r>
+        <w:t xml:space="preserve"> </w:t>
+      </w:r>
+      <w:hyperlink r:id="rId45">
+        <w:r>
+          <w:rPr>
+            <w:rStyle w:val="Hyperlink"/>
+          </w:rPr>
+          <w:t xml:space="preserve">https://www.hko.gov.hk/en/wxinfo/pastwx/2021/ywx2021.htm</w:t>
+        </w:r>
+      </w:hyperlink>
+    </w:p>
+    <w:bookmarkEnd w:id="46"/>
+    <w:bookmarkStart w:id="48" w:name="ref-ye2012"/>
+    <w:p>
+      <w:pPr>
+        <w:pStyle w:val="Bibliography"/>
+      </w:pPr>
+      <w:r>
+        <w:t xml:space="preserve">3.</w:t>
+      </w:r>
+      <w:r>
+        <w:t xml:space="preserve"> </w:t>
+      </w:r>
+      <w:r>
+        <w:t xml:space="preserve">	</w:t>
+      </w:r>
+      <w:r>
+        <w:t xml:space="preserve">Xiaofang Ye, Rodney Wolff, Weiwei Yu, Pavla Vaneckova, Xiaochuan Pan, Shilu Tong. Ambient temperature and morbidity: A review of epidemiological evidence. Environmental Health Perspectives. 2012;120(1):19–28. doi:</w:t>
+      </w:r>
+      <w:hyperlink r:id="rId47">
+        <w:r>
+          <w:rPr>
+            <w:rStyle w:val="Hyperlink"/>
+          </w:rPr>
+          <w:t xml:space="preserve">10.1289/ehp.1003198</w:t>
+        </w:r>
+      </w:hyperlink>
+    </w:p>
+    <w:bookmarkEnd w:id="48"/>
+    <w:bookmarkStart w:id="51" w:name="ref-goggins2012stroke"/>
+    <w:p>
+      <w:pPr>
+        <w:pStyle w:val="Bibliography"/>
+      </w:pPr>
+      <w:r>
+        <w:t xml:space="preserve">4.</w:t>
+      </w:r>
+      <w:r>
+        <w:t xml:space="preserve"> </w:t>
+      </w:r>
+      <w:r>
+        <w:t xml:space="preserve">	</w:t>
+      </w:r>
+      <w:r>
+        <w:t xml:space="preserve">William B. Goggins, Jean Woo, Suzanne Ho, Emily Y. Y. Chan, P. H. Chau. Weather, season, and daily stroke admissions in</w:t>
+      </w:r>
+      <w:r>
+        <w:t xml:space="preserve"> </w:t>
+      </w:r>
+      <w:r>
+        <w:t xml:space="preserve">Hong Kong</w:t>
+      </w:r>
+      <w:r>
+        <w:t xml:space="preserve">. International Journal of Biometeorology. 2012;56(5):865–72. doi:</w:t>
+      </w:r>
+      <w:hyperlink r:id="rId49">
+        <w:r>
+          <w:rPr>
+            <w:rStyle w:val="Hyperlink"/>
+          </w:rPr>
+          <w:t xml:space="preserve">10.1007/s00484-011-0491-9</w:t>
+        </w:r>
+      </w:hyperlink>
+      <w:r>
+        <w:t xml:space="preserve"> </w:t>
+      </w:r>
+      <w:r>
+        <w:t xml:space="preserve">PubMed PMID:</w:t>
+      </w:r>
+      <w:r>
+        <w:t xml:space="preserve"> </w:t>
+      </w:r>
+      <w:hyperlink r:id="rId50">
+        <w:r>
+          <w:rPr>
+            <w:rStyle w:val="Hyperlink"/>
+          </w:rPr>
+          <w:t xml:space="preserve">21915799</w:t>
+        </w:r>
+      </w:hyperlink>
+      <w:r>
+        <w:t xml:space="preserve">.</w:t>
+      </w:r>
+    </w:p>
+    <w:bookmarkEnd w:id="51"/>
+    <w:bookmarkStart w:id="54" w:name="ref-goggins2013"/>
+    <w:p>
+      <w:pPr>
+        <w:pStyle w:val="Bibliography"/>
+      </w:pPr>
+      <w:r>
+        <w:t xml:space="preserve">5.</w:t>
+      </w:r>
+      <w:r>
+        <w:t xml:space="preserve"> </w:t>
+      </w:r>
+      <w:r>
+        <w:t xml:space="preserve">	</w:t>
+      </w:r>
+      <w:r>
+        <w:t xml:space="preserve">William B. Goggins, Emily Y. Y. Chan, Chun-Yuh Yang. Weather, pollution, and acute myocardial infarction in</w:t>
+      </w:r>
+      <w:r>
+        <w:t xml:space="preserve"> </w:t>
+      </w:r>
+      <w:r>
+        <w:t xml:space="preserve">Hong Kong</w:t>
+      </w:r>
+      <w:r>
+        <w:t xml:space="preserve"> </w:t>
+      </w:r>
+      <w:r>
+        <w:t xml:space="preserve">and</w:t>
+      </w:r>
+      <w:r>
+        <w:t xml:space="preserve"> </w:t>
+      </w:r>
+      <w:r>
+        <w:t xml:space="preserve">Taiwan</w:t>
+      </w:r>
+      <w:r>
+        <w:t xml:space="preserve">. International Journal of Cardiology. 2013;168(1):243–9. doi:</w:t>
+      </w:r>
+      <w:hyperlink r:id="rId52">
+        <w:r>
+          <w:rPr>
+            <w:rStyle w:val="Hyperlink"/>
+          </w:rPr>
+          <w:t xml:space="preserve">10.1016/j.ijcard.2012.09.087</w:t>
+        </w:r>
+      </w:hyperlink>
+      <w:r>
+        <w:t xml:space="preserve"> </w:t>
+      </w:r>
+      <w:r>
+        <w:t xml:space="preserve">PubMed PMID:</w:t>
+      </w:r>
+      <w:r>
+        <w:t xml:space="preserve"> </w:t>
+      </w:r>
+      <w:hyperlink r:id="rId53">
+        <w:r>
+          <w:rPr>
+            <w:rStyle w:val="Hyperlink"/>
+          </w:rPr>
+          <w:t xml:space="preserve">23041014</w:t>
+        </w:r>
+      </w:hyperlink>
+      <w:r>
+        <w:t xml:space="preserve">.</w:t>
+      </w:r>
+    </w:p>
+    <w:bookmarkEnd w:id="54"/>
+    <w:bookmarkStart w:id="57" w:name="ref-goggins2017hf"/>
+    <w:p>
+      <w:pPr>
+        <w:pStyle w:val="Bibliography"/>
+      </w:pPr>
+      <w:r>
+        <w:t xml:space="preserve">6.</w:t>
+      </w:r>
+      <w:r>
+        <w:t xml:space="preserve"> </w:t>
+      </w:r>
+      <w:r>
+        <w:t xml:space="preserve">	</w:t>
+      </w:r>
+      <w:r>
+        <w:t xml:space="preserve">William B. Goggins, Emily Y. Y. Chan. A study of the short-term associations between hospital admissions and mortality from heart failure and meteorological variables in</w:t>
+      </w:r>
+      <w:r>
+        <w:t xml:space="preserve"> </w:t>
+      </w:r>
+      <w:r>
+        <w:t xml:space="preserve">Hong Kong</w:t>
+      </w:r>
+      <w:r>
+        <w:t xml:space="preserve">. International Journal of Cardiology. 2017;228:537–42. doi:</w:t>
+      </w:r>
+      <w:hyperlink r:id="rId55">
+        <w:r>
+          <w:rPr>
+            <w:rStyle w:val="Hyperlink"/>
+          </w:rPr>
+          <w:t xml:space="preserve">10.1016/j.ijcard.2016.11.106</w:t>
+        </w:r>
+      </w:hyperlink>
+      <w:r>
+        <w:t xml:space="preserve"> </w:t>
+      </w:r>
+      <w:r>
+        <w:t xml:space="preserve">PubMed PMID:</w:t>
+      </w:r>
+      <w:r>
+        <w:t xml:space="preserve"> </w:t>
+      </w:r>
+      <w:hyperlink r:id="rId56">
+        <w:r>
+          <w:rPr>
+            <w:rStyle w:val="Hyperlink"/>
+          </w:rPr>
+          <w:t xml:space="preserve">27875725</w:t>
+        </w:r>
+      </w:hyperlink>
+      <w:r>
+        <w:t xml:space="preserve">.</w:t>
+      </w:r>
+    </w:p>
+    <w:bookmarkEnd w:id="57"/>
+    <w:bookmarkStart w:id="59" w:name="ref-liu2020jasmine"/>
+    <w:p>
+      <w:pPr>
+        <w:pStyle w:val="Bibliography"/>
+      </w:pPr>
+      <w:r>
+        <w:t xml:space="preserve">7.</w:t>
+      </w:r>
+      <w:r>
+        <w:t xml:space="preserve"> </w:t>
+      </w:r>
+      <w:r>
+        <w:t xml:space="preserve">	</w:t>
+      </w:r>
+      <w:r>
+        <w:t xml:space="preserve">Jingwen Liu, Alana Hansen, Blesson Varghese, Zhidong Liu, Michael Tong, Hong Qiu, Linwei Tian, Kevin Ka-Lun Lau, Edward Ng, Chao Ren, Peng Bi. Cause-specific mortality attributable to cold and hot ambient temperatures in</w:t>
+      </w:r>
+      <w:r>
+        <w:t xml:space="preserve"> </w:t>
+      </w:r>
+      <w:r>
+        <w:t xml:space="preserve">Hong Kong</w:t>
+      </w:r>
+      <w:r>
+        <w:t xml:space="preserve">: A time-series study, 2006–2016. Sustainable Cities and Society. 2020;57:102131. doi:</w:t>
+      </w:r>
+      <w:hyperlink r:id="rId58">
+        <w:r>
+          <w:rPr>
+            <w:rStyle w:val="Hyperlink"/>
+          </w:rPr>
+          <w:t xml:space="preserve">10.1016/j.scs.2020.102131</w:t>
+        </w:r>
+      </w:hyperlink>
+    </w:p>
+    <w:bookmarkEnd w:id="59"/>
+    <w:bookmarkStart w:id="61" w:name="ref-liu2026roro"/>
+    <w:p>
+      <w:pPr>
+        <w:pStyle w:val="Bibliography"/>
+      </w:pPr>
+      <w:r>
+        <w:t xml:space="preserve">8.</w:t>
+      </w:r>
+      <w:r>
+        <w:t xml:space="preserve"> </w:t>
+      </w:r>
+      <w:r>
+        <w:t xml:space="preserve">	</w:t>
+      </w:r>
+      <w:r>
         <w:t xml:space="preserve">Zhenyuan Liu, Chao Ren, Jingwen Liu, Yurika Kawasaki, David Makram Bishai. Modelling the excess mortality associated with heat waves in</w:t>
       </w:r>
       <w:r>
@@ -4403,7 +5666,7 @@
       <w:r>
         <w:t xml:space="preserve">: 2014–2023. medRxiv. 2026. doi:</w:t>
       </w:r>
-      <w:hyperlink r:id="rId44">
+      <w:hyperlink r:id="rId60">
         <w:r>
           <w:rPr>
             <w:rStyle w:val="Hyperlink"/>
@@ -4412,14 +5675,14 @@
         </w:r>
       </w:hyperlink>
     </w:p>
-    <w:bookmarkEnd w:id="45"/>
-    <w:bookmarkStart w:id="47" w:name="ref-hko2013"/>
+    <w:bookmarkEnd w:id="61"/>
+    <w:bookmarkStart w:id="63" w:name="ref-guo2024hotnights"/>
     <w:p>
       <w:pPr>
         <w:pStyle w:val="Bibliography"/>
       </w:pPr>
       <w:r>
-        <w:t xml:space="preserve">2.</w:t>
+        <w:t xml:space="preserve">9.</w:t>
       </w:r>
       <w:r>
         <w:t xml:space="preserve"> </w:t>
@@ -4428,321 +5691,18 @@
         <w:t xml:space="preserve">	</w:t>
       </w:r>
       <w:r>
-        <w:t xml:space="preserve">Hong Kong Observatory. The year’s weather – 2013 [Internet]. 2014. Available from:</w:t>
+        <w:t xml:space="preserve">Yi Tong Guo, Ka Hung Chan, Hong Qiu, Eliza Lai-Yi Wong, Kin-Fai Ho. The risk of hospitalization associated with hot nights and excess nighttime heat in a subtropical metropolis: A time-series study in</w:t>
       </w:r>
       <w:r>
         <w:t xml:space="preserve"> </w:t>
       </w:r>
-      <w:hyperlink r:id="rId46">
-        <w:r>
-          <w:rPr>
-            <w:rStyle w:val="Hyperlink"/>
-          </w:rPr>
-          <w:t xml:space="preserve">https://www.hko.gov.hk/en/wxinfo/pastwx/ywx2013.htm</w:t>
-        </w:r>
-      </w:hyperlink>
-    </w:p>
-    <w:bookmarkEnd w:id="47"/>
-    <w:bookmarkStart w:id="49" w:name="ref-hko2021"/>
-    <w:p>
-      <w:pPr>
-        <w:pStyle w:val="Bibliography"/>
-      </w:pPr>
-      <w:r>
-        <w:t xml:space="preserve">3.</w:t>
-      </w:r>
-      <w:r>
-        <w:t xml:space="preserve"> </w:t>
-      </w:r>
-      <w:r>
-        <w:t xml:space="preserve">	</w:t>
-      </w:r>
-      <w:r>
-        <w:t xml:space="preserve">Hong Kong Observatory. The year’s weather – 2021 [Internet]. 2022. Available from:</w:t>
-      </w:r>
-      <w:r>
-        <w:t xml:space="preserve"> </w:t>
-      </w:r>
-      <w:hyperlink r:id="rId48">
-        <w:r>
-          <w:rPr>
-            <w:rStyle w:val="Hyperlink"/>
-          </w:rPr>
-          <w:t xml:space="preserve">https://www.hko.gov.hk/en/wxinfo/pastwx/2021/ywx2021.htm</w:t>
-        </w:r>
-      </w:hyperlink>
-    </w:p>
-    <w:bookmarkEnd w:id="49"/>
-    <w:bookmarkStart w:id="51" w:name="ref-ye2012"/>
-    <w:p>
-      <w:pPr>
-        <w:pStyle w:val="Bibliography"/>
-      </w:pPr>
-      <w:r>
-        <w:t xml:space="preserve">4.</w:t>
-      </w:r>
-      <w:r>
-        <w:t xml:space="preserve"> </w:t>
-      </w:r>
-      <w:r>
-        <w:t xml:space="preserve">	</w:t>
-      </w:r>
-      <w:r>
-        <w:t xml:space="preserve">Xiaofang Ye, Rodney Wolff, Weiwei Yu, Pavla Vaneckova, Xiaochuan Pan, Shilu Tong. Ambient temperature and morbidity: A review of epidemiological evidence. Environmental Health Perspectives. 2012;120(1):19–28. doi:</w:t>
-      </w:r>
-      <w:hyperlink r:id="rId50">
-        <w:r>
-          <w:rPr>
-            <w:rStyle w:val="Hyperlink"/>
-          </w:rPr>
-          <w:t xml:space="preserve">10.1289/ehp.1003198</w:t>
-        </w:r>
-      </w:hyperlink>
-    </w:p>
-    <w:bookmarkEnd w:id="51"/>
-    <w:bookmarkStart w:id="54" w:name="ref-goggins2012stroke"/>
-    <w:p>
-      <w:pPr>
-        <w:pStyle w:val="Bibliography"/>
-      </w:pPr>
-      <w:r>
-        <w:t xml:space="preserve">5.</w:t>
-      </w:r>
-      <w:r>
-        <w:t xml:space="preserve"> </w:t>
-      </w:r>
-      <w:r>
-        <w:t xml:space="preserve">	</w:t>
-      </w:r>
-      <w:r>
-        <w:t xml:space="preserve">William B. Goggins, Jean Woo, Suzanne Ho, Emily Y. Y. Chan, P. H. Chau. Weather, season, and daily stroke admissions in</w:t>
-      </w:r>
-      <w:r>
-        <w:t xml:space="preserve"> </w:t>
-      </w:r>
       <w:r>
         <w:t xml:space="preserve">Hong Kong</w:t>
       </w:r>
       <w:r>
-        <w:t xml:space="preserve">. International Journal of Biometeorology. 2012;56(5):865–72. doi:</w:t>
-      </w:r>
-      <w:hyperlink r:id="rId52">
-        <w:r>
-          <w:rPr>
-            <w:rStyle w:val="Hyperlink"/>
-          </w:rPr>
-          <w:t xml:space="preserve">10.1007/s00484-011-0491-9</w:t>
-        </w:r>
-      </w:hyperlink>
-      <w:r>
-        <w:t xml:space="preserve"> </w:t>
-      </w:r>
-      <w:r>
-        <w:t xml:space="preserve">PubMed PMID:</w:t>
-      </w:r>
-      <w:r>
-        <w:t xml:space="preserve"> </w:t>
-      </w:r>
-      <w:hyperlink r:id="rId53">
-        <w:r>
-          <w:rPr>
-            <w:rStyle w:val="Hyperlink"/>
-          </w:rPr>
-          <w:t xml:space="preserve">21915799</w:t>
-        </w:r>
-      </w:hyperlink>
-      <w:r>
-        <w:t xml:space="preserve">.</w:t>
-      </w:r>
-    </w:p>
-    <w:bookmarkEnd w:id="54"/>
-    <w:bookmarkStart w:id="57" w:name="ref-goggins2013"/>
-    <w:p>
-      <w:pPr>
-        <w:pStyle w:val="Bibliography"/>
-      </w:pPr>
-      <w:r>
-        <w:t xml:space="preserve">6.</w:t>
-      </w:r>
-      <w:r>
-        <w:t xml:space="preserve"> </w:t>
-      </w:r>
-      <w:r>
-        <w:t xml:space="preserve">	</w:t>
-      </w:r>
-      <w:r>
-        <w:t xml:space="preserve">William B. Goggins, Emily Y. Y. Chan, Chun-Yuh Yang. Weather, pollution, and acute myocardial infarction in</w:t>
-      </w:r>
-      <w:r>
-        <w:t xml:space="preserve"> </w:t>
-      </w:r>
-      <w:r>
-        <w:t xml:space="preserve">Hong Kong</w:t>
-      </w:r>
-      <w:r>
-        <w:t xml:space="preserve"> </w:t>
-      </w:r>
-      <w:r>
-        <w:t xml:space="preserve">and</w:t>
-      </w:r>
-      <w:r>
-        <w:t xml:space="preserve"> </w:t>
-      </w:r>
-      <w:r>
-        <w:t xml:space="preserve">Taiwan</w:t>
-      </w:r>
-      <w:r>
-        <w:t xml:space="preserve">. International Journal of Cardiology. 2013;168(1):243–9. doi:</w:t>
-      </w:r>
-      <w:hyperlink r:id="rId55">
-        <w:r>
-          <w:rPr>
-            <w:rStyle w:val="Hyperlink"/>
-          </w:rPr>
-          <w:t xml:space="preserve">10.1016/j.ijcard.2012.09.087</w:t>
-        </w:r>
-      </w:hyperlink>
-      <w:r>
-        <w:t xml:space="preserve"> </w:t>
-      </w:r>
-      <w:r>
-        <w:t xml:space="preserve">PubMed PMID:</w:t>
-      </w:r>
-      <w:r>
-        <w:t xml:space="preserve"> </w:t>
-      </w:r>
-      <w:hyperlink r:id="rId56">
-        <w:r>
-          <w:rPr>
-            <w:rStyle w:val="Hyperlink"/>
-          </w:rPr>
-          <w:t xml:space="preserve">23041014</w:t>
-        </w:r>
-      </w:hyperlink>
-      <w:r>
-        <w:t xml:space="preserve">.</w:t>
-      </w:r>
-    </w:p>
-    <w:bookmarkEnd w:id="57"/>
-    <w:bookmarkStart w:id="60" w:name="ref-goggins2017hf"/>
-    <w:p>
-      <w:pPr>
-        <w:pStyle w:val="Bibliography"/>
-      </w:pPr>
-      <w:r>
-        <w:t xml:space="preserve">7.</w:t>
-      </w:r>
-      <w:r>
-        <w:t xml:space="preserve"> </w:t>
-      </w:r>
-      <w:r>
-        <w:t xml:space="preserve">	</w:t>
-      </w:r>
-      <w:r>
-        <w:t xml:space="preserve">William B. Goggins, Emily Y. Y. Chan. A study of the short-term associations between hospital admissions and mortality from heart failure and meteorological variables in</w:t>
-      </w:r>
-      <w:r>
-        <w:t xml:space="preserve"> </w:t>
-      </w:r>
-      <w:r>
-        <w:t xml:space="preserve">Hong Kong</w:t>
-      </w:r>
-      <w:r>
-        <w:t xml:space="preserve">. International Journal of Cardiology. 2017;228:537–42. doi:</w:t>
-      </w:r>
-      <w:hyperlink r:id="rId58">
-        <w:r>
-          <w:rPr>
-            <w:rStyle w:val="Hyperlink"/>
-          </w:rPr>
-          <w:t xml:space="preserve">10.1016/j.ijcard.2016.11.106</w:t>
-        </w:r>
-      </w:hyperlink>
-      <w:r>
-        <w:t xml:space="preserve"> </w:t>
-      </w:r>
-      <w:r>
-        <w:t xml:space="preserve">PubMed PMID:</w:t>
-      </w:r>
-      <w:r>
-        <w:t xml:space="preserve"> </w:t>
-      </w:r>
-      <w:hyperlink r:id="rId59">
-        <w:r>
-          <w:rPr>
-            <w:rStyle w:val="Hyperlink"/>
-          </w:rPr>
-          <w:t xml:space="preserve">27875725</w:t>
-        </w:r>
-      </w:hyperlink>
-      <w:r>
-        <w:t xml:space="preserve">.</w:t>
-      </w:r>
-    </w:p>
-    <w:bookmarkEnd w:id="60"/>
-    <w:bookmarkStart w:id="62" w:name="ref-liu2020jasmine"/>
-    <w:p>
-      <w:pPr>
-        <w:pStyle w:val="Bibliography"/>
-      </w:pPr>
-      <w:r>
-        <w:t xml:space="preserve">8.</w:t>
-      </w:r>
-      <w:r>
-        <w:t xml:space="preserve"> </w:t>
-      </w:r>
-      <w:r>
-        <w:t xml:space="preserve">	</w:t>
-      </w:r>
-      <w:r>
-        <w:t xml:space="preserve">Jingwen Liu, Alana Hansen, Blesson Varghese, Zhidong Liu, Michael Tong, Hong Qiu, Linwei Tian, Kevin Ka-Lun Lau, Edward Ng, Chao Ren, Peng Bi. Cause-specific mortality attributable to cold and hot ambient temperatures in</w:t>
-      </w:r>
-      <w:r>
-        <w:t xml:space="preserve"> </w:t>
-      </w:r>
-      <w:r>
-        <w:t xml:space="preserve">Hong Kong</w:t>
-      </w:r>
-      <w:r>
-        <w:t xml:space="preserve">: A time-series study, 2006–2016. Sustainable Cities and Society. 2020;57:102131. doi:</w:t>
-      </w:r>
-      <w:hyperlink r:id="rId61">
-        <w:r>
-          <w:rPr>
-            <w:rStyle w:val="Hyperlink"/>
-          </w:rPr>
-          <w:t xml:space="preserve">10.1016/j.scs.2020.102131</w:t>
-        </w:r>
-      </w:hyperlink>
-    </w:p>
-    <w:bookmarkEnd w:id="62"/>
-    <w:bookmarkStart w:id="64" w:name="ref-guo2024hotnights"/>
-    <w:p>
-      <w:pPr>
-        <w:pStyle w:val="Bibliography"/>
-      </w:pPr>
-      <w:r>
-        <w:t xml:space="preserve">9.</w:t>
-      </w:r>
-      <w:r>
-        <w:t xml:space="preserve"> </w:t>
-      </w:r>
-      <w:r>
-        <w:t xml:space="preserve">	</w:t>
-      </w:r>
-      <w:r>
-        <w:t xml:space="preserve">Yi Tong Guo, Ka Hung Chan, Hong Qiu, Eliza Lai-Yi Wong, Kin-Fai Ho. The risk of hospitalization associated with hot nights and excess nighttime heat in a subtropical metropolis: A time-series study in</w:t>
-      </w:r>
-      <w:r>
-        <w:t xml:space="preserve"> </w:t>
-      </w:r>
-      <w:r>
-        <w:t xml:space="preserve">Hong Kong</w:t>
-      </w:r>
-      <w:r>
         <w:t xml:space="preserve">, 2000–2019. The Lancet Regional Health - Western Pacific. 2024;51:101168. doi:</w:t>
       </w:r>
-      <w:hyperlink r:id="rId63">
+      <w:hyperlink r:id="rId62">
         <w:r>
           <w:rPr>
             <w:rStyle w:val="Hyperlink"/>
@@ -4751,8 +5711,8 @@
         </w:r>
       </w:hyperlink>
     </w:p>
-    <w:bookmarkEnd w:id="64"/>
-    <w:bookmarkStart w:id="66" w:name="ref-greenland1989ecological"/>
+    <w:bookmarkEnd w:id="63"/>
+    <w:bookmarkStart w:id="65" w:name="ref-greenland1989ecological"/>
     <w:p>
       <w:pPr>
         <w:pStyle w:val="Bibliography"/>
@@ -4769,7 +5729,7 @@
       <w:r>
         <w:t xml:space="preserve">Sander Greenland, Hal Morgenstern. Ecological bias, confounding, and effect modification. International Journal of Epidemiology. 1989;18(1):269–74. doi:</w:t>
       </w:r>
-      <w:hyperlink r:id="rId65">
+      <w:hyperlink r:id="rId64">
         <w:r>
           <w:rPr>
             <w:rStyle w:val="Hyperlink"/>
@@ -4778,8 +5738,8 @@
         </w:r>
       </w:hyperlink>
     </w:p>
-    <w:bookmarkEnd w:id="66"/>
-    <w:bookmarkStart w:id="69" w:name="ref-bhaskaran2013"/>
+    <w:bookmarkEnd w:id="65"/>
+    <w:bookmarkStart w:id="68" w:name="ref-bhaskaran2013"/>
     <w:p>
       <w:pPr>
         <w:pStyle w:val="Bibliography"/>
@@ -4796,7 +5756,7 @@
       <w:r>
         <w:t xml:space="preserve">Krishnan Bhaskaran, Antonio Gasparrini, Shakoor Hajat, Liam Smeeth, Ben Armstrong. Time series regression studies in environmental epidemiology. International Journal of Epidemiology. 2013;42(4):1187–95. doi:</w:t>
       </w:r>
-      <w:hyperlink r:id="rId67">
+      <w:hyperlink r:id="rId66">
         <w:r>
           <w:rPr>
             <w:rStyle w:val="Hyperlink"/>
@@ -4813,7 +5773,7 @@
       <w:r>
         <w:t xml:space="preserve"> </w:t>
       </w:r>
-      <w:hyperlink r:id="rId68">
+      <w:hyperlink r:id="rId67">
         <w:r>
           <w:rPr>
             <w:rStyle w:val="Hyperlink"/>
@@ -4825,8 +5785,8 @@
         <w:t xml:space="preserve">.</w:t>
       </w:r>
     </w:p>
-    <w:bookmarkEnd w:id="69"/>
-    <w:bookmarkStart w:id="72" w:name="ref-wang2019ehwe"/>
+    <w:bookmarkEnd w:id="68"/>
+    <w:bookmarkStart w:id="71" w:name="ref-wang2019ehwe"/>
     <w:p>
       <w:pPr>
         <w:pStyle w:val="Bibliography"/>
@@ -4843,7 +5803,7 @@
       <w:r>
         <w:t xml:space="preserve">Dan Wang, Kevin Ka-Lun Lau, Chao Ren, William Bernard Goggins, Yuan Shi, Hung Chak Ho, Tsz-Cheung Lee, Lap-Shun Lee, Jean Woo, Edward Ng. The impact of extremely hot weather events on all-cause mortality in a highly urbanized and densely populated subtropical city: A 10-year time-series study (2006–2015). Science of the Total Environment. 2019;690:923–31. doi:</w:t>
       </w:r>
-      <w:hyperlink r:id="rId70">
+      <w:hyperlink r:id="rId69">
         <w:r>
           <w:rPr>
             <w:rStyle w:val="Hyperlink"/>
@@ -4860,7 +5820,7 @@
       <w:r>
         <w:t xml:space="preserve"> </w:t>
       </w:r>
-      <w:hyperlink r:id="rId71">
+      <w:hyperlink r:id="rId70">
         <w:r>
           <w:rPr>
             <w:rStyle w:val="Hyperlink"/>
@@ -4872,8 +5832,8 @@
         <w:t xml:space="preserve">.</w:t>
       </w:r>
     </w:p>
-    <w:bookmarkEnd w:id="72"/>
-    <w:bookmarkStart w:id="74" w:name="ref-li2025heatwaves"/>
+    <w:bookmarkEnd w:id="71"/>
+    <w:bookmarkStart w:id="73" w:name="ref-li2025heatwaves"/>
     <w:p>
       <w:pPr>
         <w:pStyle w:val="Bibliography"/>
@@ -4902,7 +5862,7 @@
       <w:r>
         <w:t xml:space="preserve">and their influence on pollution and extreme precipitation. Atmospheric Research. 2025;315:107845. doi:</w:t>
       </w:r>
-      <w:hyperlink r:id="rId73">
+      <w:hyperlink r:id="rId72">
         <w:r>
           <w:rPr>
             <w:rStyle w:val="Hyperlink"/>
@@ -4911,8 +5871,8 @@
         </w:r>
       </w:hyperlink>
     </w:p>
-    <w:bookmarkEnd w:id="74"/>
-    <w:bookmarkStart w:id="77" w:name="ref-basagana2024md"/>
+    <w:bookmarkEnd w:id="73"/>
+    <w:bookmarkStart w:id="76" w:name="ref-basagana2024md"/>
     <w:p>
       <w:pPr>
         <w:pStyle w:val="Bibliography"/>
@@ -4929,7 +5889,7 @@
       <w:r>
         <w:t xml:space="preserve">Xavier Basagaña, Joan Ballester. Unbiased temperature-related mortality estimates using weekly and monthly health data: A new method for environmental epidemiology and climate impact studies. The Lancet Planetary Health. 2024;8(10):e766–77. doi:</w:t>
       </w:r>
-      <w:hyperlink r:id="rId75">
+      <w:hyperlink r:id="rId74">
         <w:r>
           <w:rPr>
             <w:rStyle w:val="Hyperlink"/>
@@ -4946,7 +5906,7 @@
       <w:r>
         <w:t xml:space="preserve"> </w:t>
       </w:r>
-      <w:hyperlink r:id="rId76">
+      <w:hyperlink r:id="rId75">
         <w:r>
           <w:rPr>
             <w:rStyle w:val="Hyperlink"/>
@@ -4958,8 +5918,8 @@
         <w:t xml:space="preserve">.</w:t>
       </w:r>
     </w:p>
-    <w:bookmarkEnd w:id="77"/>
-    <w:bookmarkStart w:id="79" w:name="ref-basagana2026md"/>
+    <w:bookmarkEnd w:id="76"/>
+    <w:bookmarkStart w:id="78" w:name="ref-basagana2026md"/>
     <w:p>
       <w:pPr>
         <w:pStyle w:val="Bibliography"/>
@@ -4976,7 +5936,7 @@
       <w:r>
         <w:t xml:space="preserve">Xavier Basagaña, Joan Ballester. Unbiased estimates using temporally aggregated outcome data in time series analysis: Generalization to different outcomes, exposures, and types of aggregation. Epidemiology. 2026;37(1):16–20. doi:</w:t>
       </w:r>
-      <w:hyperlink r:id="rId78">
+      <w:hyperlink r:id="rId77">
         <w:r>
           <w:rPr>
             <w:rStyle w:val="Hyperlink"/>
@@ -4985,9 +5945,9 @@
         </w:r>
       </w:hyperlink>
     </w:p>
+    <w:bookmarkEnd w:id="78"/>
     <w:bookmarkEnd w:id="79"/>
     <w:bookmarkEnd w:id="80"/>
-    <w:bookmarkEnd w:id="81"/>
     <w:sectPr>
       <w:pgSz w:h="16838" w:w="11906"/>
       <w:pgMar w:bottom="1417" w:footer="709" w:gutter="0" w:header="709" w:left="1417" w:right="1417" w:top="1417"/>
@@ -5018,7 +5978,7 @@
       </w:r>
     </w:p>
   </w:footnote>
-  <w:footnote w:id="22">
+  <w:footnote w:id="25">
     <w:p>
       <w:pPr>
         <w:pStyle w:val="FootnoteText"/>
@@ -5033,71 +5993,7 @@
         <w:t xml:space="preserve"> </w:t>
       </w:r>
       <w:r>
-        <w:t xml:space="preserve">A count ratio of 1 means no estimated difference in the monthly count for the stated exposure change. A ratio of 1.05 means an estimated 5% higher count. Because monthly counts of cohort members still at risk of a first event were unavailable, these are count ratios rather than incidence-rate ratios.</w:t>
-      </w:r>
-    </w:p>
-  </w:footnote>
-  <w:footnote w:id="26">
-    <w:p>
-      <w:pPr>
-        <w:pStyle w:val="FootnoteText"/>
-      </w:pPr>
-      <w:r>
-        <w:rPr>
-          <w:rStyle w:val="FootnoteReference"/>
-        </w:rPr>
-        <w:footnoteRef/>
-      </w:r>
-      <w:r>
-        <w:t xml:space="preserve"> </w:t>
-      </w:r>
-      <w:r>
         <w:t xml:space="preserve">Residual serial dependence is expected in monthly counts and is material for CHD (Results). Robust intervals are not automatically wider than model-based intervals, which is why the four-construction ladder is reported.</w:t>
-      </w:r>
-    </w:p>
-  </w:footnote>
-  <w:footnote w:id="27">
-    <w:p>
-      <w:pPr>
-        <w:pStyle w:val="FootnoteText"/>
-      </w:pPr>
-      <w:r>
-        <w:rPr>
-          <w:rStyle w:val="FootnoteReference"/>
-        </w:rPr>
-        <w:footnoteRef/>
-      </w:r>
-      <w:r>
-        <w:t xml:space="preserve"> </w:t>
-      </w:r>
-      <w:r>
-        <w:t xml:space="preserve">A</w:t>
-      </w:r>
-      <w:r>
-        <w:t xml:space="preserve"> </w:t>
-      </w:r>
-      <w:r>
-        <w:rPr>
-          <w:iCs/>
-          <w:i/>
-        </w:rPr>
-        <w:t xml:space="preserve">q</w:t>
-      </w:r>
-      <w:r>
-        <w:t xml:space="preserve">-value limits the expected proportion of false discoveries across the set of comparisons. Twelve comparisons create more opportunities for a small</w:t>
-      </w:r>
-      <w:r>
-        <w:t xml:space="preserve"> </w:t>
-      </w:r>
-      <w:r>
-        <w:rPr>
-          <w:iCs/>
-          <w:i/>
-        </w:rPr>
-        <w:t xml:space="preserve">p</w:t>
-      </w:r>
-      <w:r>
-        <w:t xml:space="preserve">-value to occur by chance.</w:t>
       </w:r>
     </w:p>
   </w:footnote>
@@ -5347,6 +6243,91 @@
     <w:lvl w:ilvl="8">
       <w:numFmt w:val="bullet"/>
       <w:lvlText w:val=" "/>
+      <w:lvlJc w:val="left"/>
+      <w:pPr>
+        <w:ind w:left="6480" w:hanging="480"/>
+      </w:pPr>
+    </w:lvl>
+  </w:abstractNum>
+  <w:abstractNum w:abstractNumId="99411">
+    <w:nsid w:val="A99411"/>
+    <w:multiLevelType w:val="multilevel"/>
+    <w:lvl w:ilvl="0">
+      <w:start w:val="1"/>
+      <w:numFmt w:val="decimal"/>
+      <w:lvlText w:val="%1."/>
+      <w:lvlJc w:val="left"/>
+      <w:pPr>
+        <w:ind w:left="720" w:hanging="480"/>
+      </w:pPr>
+    </w:lvl>
+    <w:lvl w:ilvl="1">
+      <w:start w:val="1"/>
+      <w:numFmt w:val="decimal"/>
+      <w:lvlText w:val="%2."/>
+      <w:lvlJc w:val="left"/>
+      <w:pPr>
+        <w:ind w:left="1440" w:hanging="480"/>
+      </w:pPr>
+    </w:lvl>
+    <w:lvl w:ilvl="2">
+      <w:start w:val="1"/>
+      <w:numFmt w:val="decimal"/>
+      <w:lvlText w:val="%3."/>
+      <w:lvlJc w:val="left"/>
+      <w:pPr>
+        <w:ind w:left="2160" w:hanging="480"/>
+      </w:pPr>
+    </w:lvl>
+    <w:lvl w:ilvl="3">
+      <w:start w:val="1"/>
+      <w:numFmt w:val="decimal"/>
+      <w:lvlText w:val="%4."/>
+      <w:lvlJc w:val="left"/>
+      <w:pPr>
+        <w:ind w:left="2880" w:hanging="480"/>
+      </w:pPr>
+    </w:lvl>
+    <w:lvl w:ilvl="4">
+      <w:start w:val="1"/>
+      <w:numFmt w:val="decimal"/>
+      <w:lvlText w:val="%5."/>
+      <w:lvlJc w:val="left"/>
+      <w:pPr>
+        <w:ind w:left="3600" w:hanging="480"/>
+      </w:pPr>
+    </w:lvl>
+    <w:lvl w:ilvl="5">
+      <w:start w:val="1"/>
+      <w:numFmt w:val="decimal"/>
+      <w:lvlText w:val="%6."/>
+      <w:lvlJc w:val="left"/>
+      <w:pPr>
+        <w:ind w:left="4320" w:hanging="480"/>
+      </w:pPr>
+    </w:lvl>
+    <w:lvl w:ilvl="6">
+      <w:start w:val="1"/>
+      <w:numFmt w:val="decimal"/>
+      <w:lvlText w:val="%7."/>
+      <w:lvlJc w:val="left"/>
+      <w:pPr>
+        <w:ind w:left="5040" w:hanging="480"/>
+      </w:pPr>
+    </w:lvl>
+    <w:lvl w:ilvl="7">
+      <w:start w:val="1"/>
+      <w:numFmt w:val="decimal"/>
+      <w:lvlText w:val="%8."/>
+      <w:lvlJc w:val="left"/>
+      <w:pPr>
+        <w:ind w:left="5760" w:hanging="480"/>
+      </w:pPr>
+    </w:lvl>
+    <w:lvl w:ilvl="8">
+      <w:start w:val="1"/>
+      <w:numFmt w:val="decimal"/>
+      <w:lvlText w:val="%9."/>
       <w:lvlJc w:val="left"/>
       <w:pPr>
         <w:ind w:left="6480" w:hanging="480"/>
@@ -5382,6 +6363,36 @@
   </w:num>
   <w:num w:numId="1000">
     <w:abstractNumId w:val="990"/>
+  </w:num>
+  <w:num w:numId="1001">
+    <w:abstractNumId w:val="99411"/>
+    <w:lvlOverride w:ilvl="0">
+      <w:startOverride w:val="1"/>
+    </w:lvlOverride>
+    <w:lvlOverride w:ilvl="1">
+      <w:startOverride w:val="1"/>
+    </w:lvlOverride>
+    <w:lvlOverride w:ilvl="2">
+      <w:startOverride w:val="1"/>
+    </w:lvlOverride>
+    <w:lvlOverride w:ilvl="3">
+      <w:startOverride w:val="1"/>
+    </w:lvlOverride>
+    <w:lvlOverride w:ilvl="4">
+      <w:startOverride w:val="1"/>
+    </w:lvlOverride>
+    <w:lvlOverride w:ilvl="5">
+      <w:startOverride w:val="1"/>
+    </w:lvlOverride>
+    <w:lvlOverride w:ilvl="6">
+      <w:startOverride w:val="1"/>
+    </w:lvlOverride>
+    <w:lvlOverride w:ilvl="7">
+      <w:startOverride w:val="1"/>
+    </w:lvlOverride>
+    <w:lvlOverride w:ilvl="8">
+      <w:startOverride w:val="1"/>
+    </w:lvlOverride>
   </w:num>
 </w:numbering>
 </file>

</xml_diff>

<commit_message>
Rebuild Stage 3 essay and poster with Hogan Model 1/2/3 language.
The 22 August programme files still used twelve-model panel wording after Hogan asked for nested Model 1/2/3. Reported estimates remain Model 1; Models 2 and 3 are specified and unfitted. Science is unchanged. New send pack for Bishai; live manuscript is not attached.

Co-authored-by: Shen Ruililin <bobshenruililin@users.noreply.github.com>
</commit_message>
<xml_diff>
--- a/outputs/ShenRuililin_Laidlaw_Stage3Report.docx
+++ b/outputs/ShenRuililin_Laidlaw_Stage3Report.docx
@@ -304,7 +304,7 @@
         <w:t xml:space="preserve"> </w:t>
       </w:r>
       <w:r>
-        <w:t xml:space="preserve">Governed Hospital Authority aggregates supplied monthly counts of first hospitalisation after a first CHD or HF diagnosis among people with type 2 diabetes and/or hypertension, January 2013–December 2023 (132 months). Admission cause was not recorded. Six thermal measures each entered a separate negative-binomial model for each outcome: monthly mean, mean maximum and mean minimum temperature, and official counts of hot nights, very hot days and cold days. Models included calendar-month indicators, a smooth long-term trend, and a days-in-month offset. Intervals used model-based, HC1, and Newey–West lag-3 and lag-6 constructions. Benjamini–Hochberg</w:t>
+        <w:t xml:space="preserve">Governed Hospital Authority aggregates supplied monthly counts of first hospitalisation after a first CHD or HF diagnosis among people with type 2 diabetes and/or hypertension, January 2013–December 2023 (132 months). Admission cause was not recorded. Model 1 is a separate negative-binomial fit for each of six thermal measures and each outcome: monthly mean, mean maximum and mean minimum temperature, and official counts of hot nights, very hot days and cold days, with calendar-month indicators, a smooth long-term trend, and a days-in-month offset. Model 2 adds monthly mean relative humidity and monthly total rainfall. Model 3 replaces official extreme-day counts with days warmer or cooler than the historical same-calendar-day mean. Reported estimates are from Model 1. Intervals used model-based, HC1, and Newey–West lag-3 and lag-6 constructions. Benjamini–Hochberg</w:t>
       </w:r>
       <w:r>
         <w:t xml:space="preserve"> </w:t>
@@ -317,7 +317,7 @@
         <w:t xml:space="preserve">q</w:t>
       </w:r>
       <w:r>
-        <w:t xml:space="preserve">-values covered the twelve comparisons.</w:t>
+        <w:t xml:space="preserve">-values covered the twelve Model 1 comparisons.</w:t>
       </w:r>
     </w:p>
     <w:p>
@@ -628,7 +628,7 @@
         <w:pStyle w:val="BodyText"/>
       </w:pPr>
       <w:r>
-        <w:t xml:space="preserve">The objective was to estimate monthly associations between specified thermal-exposure contrasts and these first-hospitalisation counts from January 2013 through December 2023, carrying heat and cold in parallel, reporting the complete twelve-comparison panel, and testing whether monthly outcomes could support a more ambitious daily-exposure extension.</w:t>
+        <w:t xml:space="preserve">The objective was to estimate monthly associations between specified thermal-exposure contrasts and these first-hospitalisation counts from January 2013 through December 2023, carrying heat and cold in parallel, reporting the complete Model 1 panel of twelve comparisons, and testing whether monthly outcomes could support a more ambitious daily-exposure extension.</w:t>
       </w:r>
     </w:p>
     <w:bookmarkEnd w:id="21"/>
@@ -722,7 +722,7 @@
         <w:pStyle w:val="FirstParagraph"/>
       </w:pPr>
       <w:r>
-        <w:t xml:space="preserve">Daily weather observations came from Hong Kong Observatory Headquarters and were checked against annual Observatory summaries before analysis. Six measures were evaluated: monthly mean temperature; the monthly means of daily maximum and minimum temperature; hot nights (minimum temperature at least 28 °C); very hot days (maximum temperature at least 33 °C); and cold days (minimum temperature at most 12 °C). Continuous measures were interpreted per 1 °C. Extreme-day counts were interpreted per five additional days in a month. More complex heatwave definitions exist</w:t>
+        <w:t xml:space="preserve">Daily weather observations came from Hong Kong Observatory Headquarters and were checked against annual Observatory summaries before analysis. Six Model 1 measures were evaluated: monthly mean temperature; the monthly means of daily maximum and minimum temperature; hot nights (minimum temperature at least 28 °C); very hot days (maximum temperature at least 33 °C); and cold days (minimum temperature at most 12 °C). Continuous measures were interpreted per 1 °C. Extreme-day counts were interpreted per five additional days in a month. Monthly mean relative humidity and monthly total rainfall were assembled for Model 2; they are not in the Model 1 estimates below. More complex heatwave definitions exist</w:t>
       </w:r>
       <w:r>
         <w:t xml:space="preserve"> </w:t>
@@ -753,7 +753,7 @@
         <w:t xml:space="preserve">]</w:t>
       </w:r>
       <w:r>
-        <w:t xml:space="preserve">; the six measures give the clearest common comparison. Air-pollution and influenza series were assembled for the broader project; the core models reported here do not claim that confounding by those factors has been resolved.</w:t>
+        <w:t xml:space="preserve">; the six measures give the clearest common comparison. Air-pollution and influenza series were assembled for the broader project; Model 1 does not claim that confounding by those factors has been resolved.</w:t>
       </w:r>
     </w:p>
     <w:bookmarkEnd w:id="24"/>
@@ -771,7 +771,7 @@
         <w:pStyle w:val="FirstParagraph"/>
       </w:pPr>
       <w:r>
-        <w:t xml:space="preserve">Separate negative-binomial models were fitted for each outcome and each exposure, giving twelve core comparisons</w:t>
+        <w:t xml:space="preserve">Model 1 comprises separate negative-binomial fits for each outcome and each thermal exposure, giving twelve comparisons</w:t>
       </w:r>
       <w:r>
         <w:t xml:space="preserve"> </w:t>
@@ -791,7 +791,7 @@
         <w:t xml:space="preserve">]</w:t>
       </w:r>
       <w:r>
-        <w:t xml:space="preserve">. Each model included calendar-month indicators, a natural cubic spline of month index with 4 degrees of freedom, and a days-in-month offset. Uncertainty was reported four ways: model-based, HC1, and Newey–West with lags of three and six months.</w:t>
+        <w:t xml:space="preserve">. Each fit included calendar-month indicators, a natural cubic spline of month index with 4 degrees of freedom, and a days-in-month offset. Model 2 adds monthly mean relative humidity and monthly total rainfall to that specification. Model 3 keeps the Model 1 structure but replaces official extreme-day counts with counts of days whose daily mean temperature was above or below the leave-one-year-out mean for that calendar day; maximum- and minimum-temperature versions of those counts are sensitivities. Model 2 and Model 3 are specified; they have not been fitted to the governed health panel in this report, and no health coefficients are invented for them. Uncertainty for Model 1 was reported four ways: model-based, HC1, and Newey–West with lags of three and six months.</w:t>
       </w:r>
       <w:r>
         <w:rPr>
@@ -816,7 +816,7 @@
         <w:t xml:space="preserve">q</w:t>
       </w:r>
       <w:r>
-        <w:t xml:space="preserve">-values were calculated across the complete panel.</w:t>
+        <w:t xml:space="preserve">-values were calculated across the twelve Model 1 comparisons.</w:t>
       </w:r>
     </w:p>
     <w:p>
@@ -1469,13 +1469,13 @@
       </w:r>
     </w:p>
     <w:bookmarkEnd w:id="31"/>
-    <w:bookmarkStart w:id="35" w:name="core-panel"/>
+    <w:bookmarkStart w:id="35" w:name="model-1"/>
     <w:p>
       <w:pPr>
         <w:pStyle w:val="Heading2"/>
       </w:pPr>
       <w:r>
-        <w:t xml:space="preserve">Core panel</w:t>
+        <w:t xml:space="preserve">Model 1</w:t>
       </w:r>
     </w:p>
     <w:p>
@@ -1491,7 +1491,7 @@
           <w:b/>
           <w:sz w:val="20"/>
         </w:rPr>
-        <w:t xml:space="preserve">Table 2 reports the twelve separate-exposure count ratios under Newey–West lag-6 intervals. Most estimates were close to 1. The largest CHD estimate was for hot nights: 1.022 per five additional hot nights (1.002–1.042;</w:t>
+        <w:t xml:space="preserve">Table 2 reports the twelve separate-exposure Model 1 count ratios under Newey–West lag-6 intervals. Most estimates were close to 1. The largest CHD estimate was for hot nights: 1.022 per five additional hot nights (1.002–1.042;</w:t>
       </w:r>
       <w:r>
         <w:rPr>
@@ -1652,7 +1652,7 @@
           <w:b/>
           <w:sz w:val="20"/>
         </w:rPr>
-        <w:t xml:space="preserve">Separate negative-binomial models with a days-in-month offset and Newey–West lag-6 intervals.</w:t>
+        <w:t xml:space="preserve">Model 1: separate negative-binomial models with a days-in-month offset and Newey–West lag-6 intervals. Thermal exposures only.</w:t>
       </w:r>
     </w:p>
     <w:tbl>
@@ -3425,7 +3425,7 @@
           <wp:inline>
             <wp:extent cx="5062728" cy="3192587"/>
             <wp:effectExtent b="0" l="0" r="0" t="0"/>
-            <wp:docPr descr="Count ratios and 95% confidence intervals for the twelve core monthly models. The dashed line at 1 indicates no estimated difference. All twelve Benjamini–Hochberg q-values exceeded 0.19." title="" id="33" name="Picture"/>
+            <wp:docPr descr="Count ratios and 95% confidence intervals for the twelve Model 1 monthly fits. The dashed line at 1 indicates no estimated difference. All twelve Benjamini–Hochberg q-values exceeded 0.19." title="" id="33" name="Picture"/>
             <a:graphic>
               <a:graphicData uri="http://schemas.openxmlformats.org/drawingml/2006/picture">
                 <pic:pic>
@@ -3468,7 +3468,7 @@
         <w:pStyle w:val="ImageCaption"/>
       </w:pPr>
       <w:r>
-        <w:t xml:space="preserve">Count ratios and 95% confidence intervals for the twelve core monthly models. The dashed line at 1 indicates no estimated difference. All twelve Benjamini–Hochberg</w:t>
+        <w:t xml:space="preserve">Count ratios and 95% confidence intervals for the twelve Model 1 monthly fits. The dashed line at 1 indicates no estimated difference. All twelve Benjamini–Hochberg</w:t>
       </w:r>
       <w:r>
         <w:t xml:space="preserve"> </w:t>
@@ -3558,7 +3558,7 @@
         <w:pStyle w:val="FirstParagraph"/>
       </w:pPr>
       <w:r>
-        <w:t xml:space="preserve">These data do not support a multiplicity-protected differential thermal claim. Under Newey–West lag-6 reporting, CHD first-hospitalisation counts were more closely associated with official hot-night burden than with mean temperature or very hot days, and HF counts were more closely associated with cold-day burden than with any heat measure. Both patterns sit inside a twelve-contrast family in which every</w:t>
+        <w:t xml:space="preserve">These data do not support a multiplicity-protected differential thermal claim. Under Newey–West lag-6 reporting, CHD first-hospitalisation counts were more closely associated with official hot-night burden than with mean temperature or very hot days, and HF counts were more closely associated with cold-day burden than with any heat measure. Both patterns sit inside the twelve Model 1 comparisons, in which every</w:t>
       </w:r>
       <w:r>
         <w:t xml:space="preserve"> </w:t>
@@ -3571,7 +3571,7 @@
         <w:t xml:space="preserve">q</w:t>
       </w:r>
       <w:r>
-        <w:t xml:space="preserve">-value exceeds 0.19. The twelve models were specified after the outcome series was available. The complete panel is therefore reported, and no contrast is promoted to a primary result.</w:t>
+        <w:t xml:space="preserve">-value exceeds 0.19. The twelve Model 1 fits were specified after the outcome series was available. The complete Model 1 panel is therefore reported, and no contrast is promoted to a primary result.</w:t>
       </w:r>
     </w:p>
     <w:p>
@@ -3689,7 +3689,7 @@
         <w:t xml:space="preserve"> </w:t>
       </w:r>
       <w:r>
-        <w:t xml:space="preserve">The twelve-contrast panel is reported in full. Uncertainty is shown as an explicit four-construction ladder. Extreme-day exposures use published official thresholds. Weather definitions were source-checked against Observatory summaries. The daily-recovery analysis is reported as a refusal rather than as a coefficient.</w:t>
+        <w:t xml:space="preserve">The twelve Model 1 comparisons are reported in full. Uncertainty is shown as an explicit four-construction ladder. Extreme-day exposures use published official thresholds. Weather definitions were source-checked against Observatory summaries. The daily-recovery analysis is reported as a refusal rather than as a coefficient.</w:t>
       </w:r>
     </w:p>
     <w:p>
@@ -3815,7 +3815,7 @@
         <w:t xml:space="preserve"> </w:t>
       </w:r>
       <w:r>
-        <w:t xml:space="preserve">Adjustment for pollution, humidity and influenza is unresolved in the core panel.</w:t>
+        <w:t xml:space="preserve">Adjustment for pollution, humidity and influenza is unresolved in Model 1. Model 2 specifies humidity and rainfall but is not fitted here. Model 3 is specified and is likewise unfitted.</w:t>
       </w:r>
     </w:p>
     <w:p>
@@ -3982,7 +3982,7 @@
         <w:pStyle w:val="BodyText"/>
       </w:pPr>
       <w:r>
-        <w:t xml:space="preserve">The study therefore offers hypotheses, not proof of thermal effects. What it leaves behind is a precisely defined first-event outcome, a complete twelve-comparison panel, uncertainty shown under four methods, and a documented refusal to produce daily coefficients that monthly counts cannot support.</w:t>
+        <w:t xml:space="preserve">The study therefore offers hypotheses, not proof of thermal effects. What it leaves behind is a precisely defined first-event outcome, a complete twelve-comparison Model 1 panel, uncertainty shown under four methods, and a documented refusal to produce daily coefficients that monthly counts cannot support.</w:t>
       </w:r>
     </w:p>
     <w:bookmarkEnd w:id="40"/>

</xml_diff>